<commit_message>
added kard, wearable and the mhealth models complete
</commit_message>
<xml_diff>
--- a/documents/paper.docx
+++ b/documents/paper.docx
@@ -110,7 +110,7 @@
           <w:noProof/>
         </w:rPr>
         <w:drawing>
-          <wp:anchor distT="0" distB="0" distL="114300" distR="114300" simplePos="0" relativeHeight="251663360" behindDoc="0" locked="0" layoutInCell="1" allowOverlap="1" wp14:anchorId="3E04AFCD" wp14:editId="1DDD1661">
+          <wp:anchor distT="0" distB="0" distL="114300" distR="114300" simplePos="0" relativeHeight="251663360" behindDoc="0" locked="0" layoutInCell="1" allowOverlap="1" wp14:anchorId="3E04AFCD" wp14:editId="60EFECB8">
             <wp:simplePos x="0" y="0"/>
             <wp:positionH relativeFrom="margin">
               <wp:align>left</wp:align>
@@ -199,15 +199,7 @@
           <w:b/>
           <w:bCs/>
         </w:rPr>
-        <w:t xml:space="preserve">Figure </w:t>
-      </w:r>
-      <w:r>
-        <w:rPr>
-          <w:rFonts w:ascii="Times New Roman" w:hAnsi="Times New Roman" w:cs="Times New Roman"/>
-          <w:b/>
-          <w:bCs/>
-        </w:rPr>
-        <w:t>1</w:t>
+        <w:t>Figure 1</w:t>
       </w:r>
       <w:r>
         <w:rPr>
@@ -223,15 +215,7 @@
           <w:b/>
           <w:bCs/>
         </w:rPr>
-        <w:t xml:space="preserve"> </w:t>
-      </w:r>
-      <w:r>
-        <w:rPr>
-          <w:rFonts w:ascii="Times New Roman" w:hAnsi="Times New Roman" w:cs="Times New Roman"/>
-          <w:b/>
-          <w:bCs/>
-        </w:rPr>
-        <w:t>Microsoft Kinect Sensor Xbox One</w:t>
+        <w:t xml:space="preserve"> Microsoft Kinect Sensor Xbox One</w:t>
       </w:r>
     </w:p>
     <w:p>
@@ -413,54 +397,444 @@
         <w:rPr>
           <w:rFonts w:ascii="Times New Roman" w:hAnsi="Times New Roman" w:cs="Times New Roman"/>
         </w:rPr>
-        <w:t xml:space="preserve">Human Activity Recognition (HAR) using the Kinect sensor has evolved through multiple generations of methodological development—from statistical feature engineering to deep learning architectures capable of learning complex </w:t>
-      </w:r>
+        <w:t xml:space="preserve">Human Activity Recognition (HAR) has emerged as a prominent research domain, attracting considerable attention from the computer vision and machine learning communities. Over the past decade, numerous studies have proposed diverse methodologies—ranging from classical machine learning approaches to sophisticated deep learning architectures—for recognizing and </w:t>
+      </w:r>
+      <w:r>
+        <w:rPr>
+          <w:rFonts w:ascii="Times New Roman" w:hAnsi="Times New Roman" w:cs="Times New Roman"/>
+        </w:rPr>
+        <w:lastRenderedPageBreak/>
+        <w:t>classifying human activities from various sensor modalities, including RGB cameras, depth sensors, inertial measurement units (IMUs), and wearable devices. This section provides a comprehensive review of the existing literature that is most relevant to the present study.</w:t>
+      </w:r>
+    </w:p>
+    <w:p>
+      <w:pPr>
+        <w:jc w:val="both"/>
+        <w:rPr>
+          <w:rFonts w:ascii="Times New Roman" w:hAnsi="Times New Roman" w:cs="Times New Roman"/>
+        </w:rPr>
+      </w:pPr>
+    </w:p>
+    <w:p>
+      <w:pPr>
+        <w:jc w:val="both"/>
+        <w:rPr>
+          <w:rFonts w:ascii="Times New Roman" w:hAnsi="Times New Roman" w:cs="Times New Roman"/>
+          <w:b/>
+          <w:bCs/>
+        </w:rPr>
+      </w:pPr>
+      <w:r>
+        <w:rPr>
+          <w:rFonts w:ascii="Times New Roman" w:hAnsi="Times New Roman" w:cs="Times New Roman"/>
+          <w:b/>
+          <w:bCs/>
+        </w:rPr>
+        <w:t>2.1 Survey and Review Studies on HAR</w:t>
+      </w:r>
+    </w:p>
+    <w:p>
+      <w:pPr>
+        <w:jc w:val="both"/>
+        <w:rPr>
+          <w:rFonts w:ascii="Times New Roman" w:hAnsi="Times New Roman" w:cs="Times New Roman"/>
+        </w:rPr>
+      </w:pPr>
       <w:proofErr w:type="spellStart"/>
       <w:r>
         <w:rPr>
           <w:rFonts w:ascii="Times New Roman" w:hAnsi="Times New Roman" w:cs="Times New Roman"/>
         </w:rPr>
-        <w:t>spatio</w:t>
+        <w:t>Kaseris</w:t>
       </w:r>
       <w:proofErr w:type="spellEnd"/>
       <w:r>
         <w:rPr>
           <w:rFonts w:ascii="Times New Roman" w:hAnsi="Times New Roman" w:cs="Times New Roman"/>
         </w:rPr>
-        <w:t xml:space="preserve">-temporal patterns directly from data. Since the Kinect provides synchronized depth maps and articulated skeletal joint positions, </w:t>
+        <w:t xml:space="preserve"> et al. [1] presented a comprehensive survey on deep learning methods applied to human activity recognition. The authors concluded that while vision-based HAR systems can effectively address environmental challenges such as varying lighting conditions, future performance improvements will depend significantly on high-quality data normalization techniques and the continued paradigm shift toward automatic feature extraction through deep neural networks. The survey further highlighted that vision sensors, such as Microsoft Kinect, provide skeletal data representations in lower-dimensional spaces, thereby facilitating swifter processing and enabling real-time applications in domains such as surveillance and eldercare.</w:t>
+      </w:r>
+    </w:p>
+    <w:p>
+      <w:pPr>
+        <w:jc w:val="both"/>
+        <w:rPr>
+          <w:rFonts w:ascii="Times New Roman" w:hAnsi="Times New Roman" w:cs="Times New Roman"/>
+        </w:rPr>
+      </w:pPr>
+    </w:p>
+    <w:p>
+      <w:pPr>
+        <w:jc w:val="both"/>
+        <w:rPr>
+          <w:rFonts w:ascii="Times New Roman" w:hAnsi="Times New Roman" w:cs="Times New Roman"/>
+        </w:rPr>
+      </w:pPr>
+      <w:r>
+        <w:rPr>
+          <w:rFonts w:ascii="Times New Roman" w:hAnsi="Times New Roman" w:cs="Times New Roman"/>
+        </w:rPr>
+        <w:t xml:space="preserve">Similarly, Hossen and Abas [17] conducted an extensive review of machine learning techniques for HAR, examining state-of-the-art methods and emerging trends. They concluded that future research must prioritize scalability and adaptability to real-world environments </w:t>
+      </w:r>
+      <w:proofErr w:type="gramStart"/>
+      <w:r>
+        <w:rPr>
+          <w:rFonts w:ascii="Times New Roman" w:hAnsi="Times New Roman" w:cs="Times New Roman"/>
+        </w:rPr>
+        <w:t>in order to</w:t>
+      </w:r>
+      <w:proofErr w:type="gramEnd"/>
+      <w:r>
+        <w:rPr>
+          <w:rFonts w:ascii="Times New Roman" w:hAnsi="Times New Roman" w:cs="Times New Roman"/>
+        </w:rPr>
+        <w:t xml:space="preserve"> overcome persistent challenges such as sensor noise and class imbalance. Their review highlighted </w:t>
+      </w:r>
+      <w:proofErr w:type="gramStart"/>
+      <w:r>
+        <w:rPr>
+          <w:rFonts w:ascii="Times New Roman" w:hAnsi="Times New Roman" w:cs="Times New Roman"/>
+        </w:rPr>
+        <w:t>that advanced frameworks</w:t>
+      </w:r>
+      <w:proofErr w:type="gramEnd"/>
+      <w:r>
+        <w:rPr>
+          <w:rFonts w:ascii="Times New Roman" w:hAnsi="Times New Roman" w:cs="Times New Roman"/>
+        </w:rPr>
+        <w:t xml:space="preserve"> like PoseConv3D, which utilizes three-dimensional heatmap volumes, achieved strong average accuracies across benchmark datasets, including 97.1% on the NTU60 dataset. The authors emphasized the continued need for innovation and interdisciplinary collaboration to advance HAR technology.</w:t>
+      </w:r>
+    </w:p>
+    <w:p>
+      <w:pPr>
+        <w:jc w:val="both"/>
+        <w:rPr>
+          <w:rFonts w:ascii="Times New Roman" w:hAnsi="Times New Roman" w:cs="Times New Roman"/>
+        </w:rPr>
+      </w:pPr>
+    </w:p>
+    <w:p>
+      <w:pPr>
+        <w:jc w:val="both"/>
+        <w:rPr>
+          <w:rFonts w:ascii="Times New Roman" w:hAnsi="Times New Roman" w:cs="Times New Roman"/>
+        </w:rPr>
+      </w:pPr>
+      <w:r>
+        <w:rPr>
+          <w:rFonts w:ascii="Times New Roman" w:hAnsi="Times New Roman" w:cs="Times New Roman"/>
+        </w:rPr>
+        <w:t xml:space="preserve">Sarveshwaran et al. [14] investigated the application of deep learning for human activity recognition and concluded that, although deep learning significantly advances HAR capabilities, unresolved problems remain regarding real-world interference and noise. Their analysis demonstrated that ensemble learning models reduce pre-processing time by supporting automatic feature extraction. Specifically, they reported that </w:t>
+      </w:r>
+      <w:proofErr w:type="spellStart"/>
+      <w:r>
+        <w:rPr>
+          <w:rFonts w:ascii="Times New Roman" w:hAnsi="Times New Roman" w:cs="Times New Roman"/>
+        </w:rPr>
+        <w:t>ResNet</w:t>
+      </w:r>
+      <w:proofErr w:type="spellEnd"/>
+      <w:r>
+        <w:rPr>
+          <w:rFonts w:ascii="Times New Roman" w:hAnsi="Times New Roman" w:cs="Times New Roman"/>
+        </w:rPr>
+        <w:t xml:space="preserve"> v2 achieved high accuracy scores of 91% and 92% across the UCI 101 and HMDB 51 video datasets, respectively.</w:t>
+      </w:r>
+    </w:p>
+    <w:p>
+      <w:pPr>
+        <w:jc w:val="both"/>
+        <w:rPr>
+          <w:rFonts w:ascii="Times New Roman" w:hAnsi="Times New Roman" w:cs="Times New Roman"/>
+        </w:rPr>
+      </w:pPr>
+    </w:p>
+    <w:p>
+      <w:pPr>
+        <w:jc w:val="both"/>
+        <w:rPr>
+          <w:rFonts w:ascii="Times New Roman" w:hAnsi="Times New Roman" w:cs="Times New Roman"/>
+          <w:b/>
+          <w:bCs/>
+        </w:rPr>
+      </w:pPr>
+      <w:r>
+        <w:rPr>
+          <w:rFonts w:ascii="Times New Roman" w:hAnsi="Times New Roman" w:cs="Times New Roman"/>
+          <w:b/>
+          <w:bCs/>
+        </w:rPr>
+        <w:t>2.2 Hybrid Deep Learning Architectures for HAR</w:t>
+      </w:r>
+    </w:p>
+    <w:p>
+      <w:pPr>
+        <w:jc w:val="both"/>
+        <w:rPr>
+          <w:rFonts w:ascii="Times New Roman" w:hAnsi="Times New Roman" w:cs="Times New Roman"/>
+        </w:rPr>
+      </w:pPr>
+      <w:r>
+        <w:rPr>
+          <w:rFonts w:ascii="Times New Roman" w:hAnsi="Times New Roman" w:cs="Times New Roman"/>
+        </w:rPr>
+        <w:t>A substantial body of research has focused on developing hybrid deep learning models that combine the strengths of multiple architectures to improve activity recognition performance. Lalwani and Ganeshan [2] proposed a novel CNN-</w:t>
+      </w:r>
+      <w:proofErr w:type="spellStart"/>
+      <w:r>
+        <w:rPr>
+          <w:rFonts w:ascii="Times New Roman" w:hAnsi="Times New Roman" w:cs="Times New Roman"/>
+        </w:rPr>
+        <w:t>BiLSTM</w:t>
+      </w:r>
+      <w:proofErr w:type="spellEnd"/>
+      <w:r>
+        <w:rPr>
+          <w:rFonts w:ascii="Times New Roman" w:hAnsi="Times New Roman" w:cs="Times New Roman"/>
+        </w:rPr>
+        <w:t xml:space="preserve">-GRU hybrid deep learning model for human activity recognition, which achieved a remarkable accuracy of 99.7% on the Wireless Sensor Data Mining (WISDM) dataset. The authors concluded that parameter optimization is critical for model performance, specifically identifying a batch size of 0.3 as the optimal setting for improving model robustness and convergence. The results, validated </w:t>
       </w:r>
       <w:r>
         <w:rPr>
           <w:rFonts w:ascii="Times New Roman" w:hAnsi="Times New Roman" w:cs="Times New Roman"/>
         </w:rPr>
         <w:lastRenderedPageBreak/>
-        <w:t>researchers quickly recognized its potential as a reliable, non-wearable sensing platform for capturing human motion in both controlled and natural environments. As a result, Kinect-based HAR became a central research domain within computer vision and ubiquitous computing.</w:t>
-      </w:r>
-      <w:r>
-        <w:rPr>
-          <w:rFonts w:ascii="Times New Roman" w:hAnsi="Times New Roman" w:cs="Times New Roman"/>
-        </w:rPr>
-        <w:t xml:space="preserve"> </w:t>
-      </w:r>
-    </w:p>
-    <w:p>
-      <w:pPr>
-        <w:jc w:val="both"/>
-        <w:rPr>
-          <w:rFonts w:ascii="Times New Roman" w:hAnsi="Times New Roman" w:cs="Times New Roman"/>
-        </w:rPr>
-      </w:pPr>
-      <w:r>
-        <w:rPr>
-          <w:rFonts w:ascii="Times New Roman" w:hAnsi="Times New Roman" w:cs="Times New Roman"/>
-        </w:rPr>
-        <w:t xml:space="preserve">Early skeletal-based HAR studies largely depended on handcrafted features extracted from the Kinect’s 3D joint coordinates. Ramu Reddy and Chattopadhyay laid important groundwork by showing that simple statistical features such as the maximum–minimum joint displacement (range) and mean coordinate values could capture essential characteristics of human movement. Using SVMs as the classifier, their model achieved 97.29% accuracy on a custom Kinect dataset and 94.06% on the MSR 3D Daily Activity dataset, demonstrating that even low-dimensional representations derived from joint geometry can be highly discriminative. Gaglio and colleagues expanded this idea by integrating posture clustering using k-means, followed by SVM and Hidden Markov Models to incorporate temporal structure. Their method achieved 84.8% precision and 84.5% recall across eighteen activities, revealing the importance of </w:t>
+        <w:t>through ANOVA statistical testing, confirmed that the model is statistically reliable and highly effective for real-world applications in bipedal robotics and healthcare.</w:t>
+      </w:r>
+    </w:p>
+    <w:p>
+      <w:pPr>
+        <w:jc w:val="both"/>
+        <w:rPr>
+          <w:rFonts w:ascii="Times New Roman" w:hAnsi="Times New Roman" w:cs="Times New Roman"/>
+        </w:rPr>
+      </w:pPr>
+    </w:p>
+    <w:p>
+      <w:pPr>
+        <w:jc w:val="both"/>
+        <w:rPr>
+          <w:rFonts w:ascii="Times New Roman" w:hAnsi="Times New Roman" w:cs="Times New Roman"/>
+        </w:rPr>
+      </w:pPr>
+      <w:r>
+        <w:rPr>
+          <w:rFonts w:ascii="Times New Roman" w:hAnsi="Times New Roman" w:cs="Times New Roman"/>
+        </w:rPr>
+        <w:t>Challa et al. [3] introduced a multibranch CNN-</w:t>
       </w:r>
       <w:proofErr w:type="spellStart"/>
       <w:r>
         <w:rPr>
           <w:rFonts w:ascii="Times New Roman" w:hAnsi="Times New Roman" w:cs="Times New Roman"/>
         </w:rPr>
+        <w:t>BiLSTM</w:t>
+      </w:r>
+      <w:proofErr w:type="spellEnd"/>
+      <w:r>
+        <w:rPr>
+          <w:rFonts w:ascii="Times New Roman" w:hAnsi="Times New Roman" w:cs="Times New Roman"/>
+        </w:rPr>
+        <w:t xml:space="preserve"> model for human activity recognition using wearable sensor data. The authors concluded that their proposed multibranch architecture, which employs convolutional kernels of different sizes across parallel branches, is highly effective at capturing various temporal local dependencies inherent in sensor signals. The model achieved impressive classification accuracies of 96.05% on the WISDM dataset, 96.37% on the UCI-HAR dataset, and 94.29% on the PAMAP2 dataset. Notably, they highlighted that the tri-branch configuration maintains a superior trade-off between recognition accuracy and computational cost compared to single-branch or quad-branch model variants.</w:t>
+      </w:r>
+    </w:p>
+    <w:p>
+      <w:pPr>
+        <w:jc w:val="both"/>
+        <w:rPr>
+          <w:rFonts w:ascii="Times New Roman" w:hAnsi="Times New Roman" w:cs="Times New Roman"/>
+        </w:rPr>
+      </w:pPr>
+    </w:p>
+    <w:p>
+      <w:pPr>
+        <w:jc w:val="both"/>
+        <w:rPr>
+          <w:rFonts w:ascii="Times New Roman" w:hAnsi="Times New Roman" w:cs="Times New Roman"/>
+        </w:rPr>
+      </w:pPr>
+      <w:proofErr w:type="spellStart"/>
+      <w:r>
+        <w:rPr>
+          <w:rFonts w:ascii="Times New Roman" w:hAnsi="Times New Roman" w:cs="Times New Roman"/>
+        </w:rPr>
+        <w:t>Tokas</w:t>
+      </w:r>
+      <w:proofErr w:type="spellEnd"/>
+      <w:r>
+        <w:rPr>
+          <w:rFonts w:ascii="Times New Roman" w:hAnsi="Times New Roman" w:cs="Times New Roman"/>
+        </w:rPr>
+        <w:t xml:space="preserve"> et al. [5] reported on a real-time deployable attention-driven CNN-LSTM framework for human activity recognition using wearable sensors. Their system achieved an average accuracy of 99.5% across three public benchmarks, including a peak accuracy of 99.7% on the mHealth dataset. The authors concluded that the integration of a Convolutional Block Attention Module (CBAM) and self-attention mechanism allows the model to refine spatial and temporal features by focusing selectively on the most informative frames. Furthermore, the application of structured pruning and quantization techniques successfully produced a lightweight model suitable for real-time deployment on smartphones without degrading recognition performance.</w:t>
+      </w:r>
+    </w:p>
+    <w:p>
+      <w:pPr>
+        <w:jc w:val="both"/>
+        <w:rPr>
+          <w:rFonts w:ascii="Times New Roman" w:hAnsi="Times New Roman" w:cs="Times New Roman"/>
+        </w:rPr>
+      </w:pPr>
+    </w:p>
+    <w:p>
+      <w:pPr>
+        <w:jc w:val="both"/>
+        <w:rPr>
+          <w:rFonts w:ascii="Times New Roman" w:hAnsi="Times New Roman" w:cs="Times New Roman"/>
+        </w:rPr>
+      </w:pPr>
+      <w:r>
+        <w:rPr>
+          <w:rFonts w:ascii="Times New Roman" w:hAnsi="Times New Roman" w:cs="Times New Roman"/>
+        </w:rPr>
+        <w:t>Khatun et al. [8] proposed a deep CNN-LSTM architecture augmented with a self-attention mechanism for human activity recognition using wearable sensor data. The authors concluded that their hybrid model efficiently extracts discriminative features from raw sensor signals, achieving a 99.93% accuracy on their personalized H-Activity dataset. The model also demonstrated robustness on established benchmark datasets, reaching 98.76% on MHEALTH and 93.11% on UCI-HAR. They demonstrated that the self-attention mechanism significantly enhances the model's predictive capabilities and could be effectively applied in clinical settings for monitoring elderly health.</w:t>
+      </w:r>
+    </w:p>
+    <w:p>
+      <w:pPr>
+        <w:jc w:val="both"/>
+        <w:rPr>
+          <w:rFonts w:ascii="Times New Roman" w:hAnsi="Times New Roman" w:cs="Times New Roman"/>
+        </w:rPr>
+      </w:pPr>
+    </w:p>
+    <w:p>
+      <w:pPr>
+        <w:jc w:val="both"/>
+        <w:rPr>
+          <w:rFonts w:ascii="Times New Roman" w:hAnsi="Times New Roman" w:cs="Times New Roman"/>
+        </w:rPr>
+      </w:pPr>
+      <w:r>
+        <w:rPr>
+          <w:rFonts w:ascii="Times New Roman" w:hAnsi="Times New Roman" w:cs="Times New Roman"/>
+        </w:rPr>
+        <w:t>Garcia-Gonzalez et al.</w:t>
+      </w:r>
+      <w:r>
+        <w:rPr>
+          <w:rFonts w:ascii="Times New Roman" w:hAnsi="Times New Roman" w:cs="Times New Roman"/>
+        </w:rPr>
+        <w:t xml:space="preserve"> [36]</w:t>
+      </w:r>
+      <w:r>
+        <w:rPr>
+          <w:rFonts w:ascii="Times New Roman" w:hAnsi="Times New Roman" w:cs="Times New Roman"/>
+        </w:rPr>
+        <w:t xml:space="preserve"> investigated deep learning models for real-life human activity recognition from smartphone sensor data and concluded that deep learning algorithms represent the optimal choice for HAR in real-life environments, surpassing traditional machine learning results with a peak accuracy of 94.80%. They found that a 90-second sliding window size and the combination of accelerometer and gyroscope sensors provided the highest-quality results. Their DS-CNN-LSTM hybrid model proved particularly effective, especially when individual sensor streams were evaluated independently before concatenation.</w:t>
+      </w:r>
+    </w:p>
+    <w:p>
+      <w:pPr>
+        <w:jc w:val="both"/>
+        <w:rPr>
+          <w:rFonts w:ascii="Times New Roman" w:hAnsi="Times New Roman" w:cs="Times New Roman"/>
+        </w:rPr>
+      </w:pPr>
+    </w:p>
+    <w:p>
+      <w:pPr>
+        <w:jc w:val="both"/>
+        <w:rPr>
+          <w:rFonts w:ascii="Times New Roman" w:hAnsi="Times New Roman" w:cs="Times New Roman"/>
+        </w:rPr>
+      </w:pPr>
+      <w:r>
+        <w:rPr>
+          <w:rFonts w:ascii="Times New Roman" w:hAnsi="Times New Roman" w:cs="Times New Roman"/>
+        </w:rPr>
+        <w:lastRenderedPageBreak/>
+        <w:t>Sain et al. [20] proposed a hybrid CNN-</w:t>
+      </w:r>
+      <w:proofErr w:type="spellStart"/>
+      <w:r>
+        <w:rPr>
+          <w:rFonts w:ascii="Times New Roman" w:hAnsi="Times New Roman" w:cs="Times New Roman"/>
+        </w:rPr>
+        <w:t>BiLSTM</w:t>
+      </w:r>
+      <w:proofErr w:type="spellEnd"/>
+      <w:r>
+        <w:rPr>
+          <w:rFonts w:ascii="Times New Roman" w:hAnsi="Times New Roman" w:cs="Times New Roman"/>
+        </w:rPr>
+        <w:t xml:space="preserve"> deep learning model for human action recognition in indoor environments. The authors concluded that their architecture achieves state-of-the-art results, reaching 99.5% accuracy on the LNMIIT-KHAD dataset. They highlighted that the model's reliance on skeletal joint angles and kinematic features makes it exceptionally robust against variations in illumination and cluttered backgrounds. Furthermore, the model demonstrated strong generalization capability across diverse sensing conditions and extended accurately to activities outside the training set.</w:t>
+      </w:r>
+    </w:p>
+    <w:p>
+      <w:pPr>
+        <w:jc w:val="both"/>
+        <w:rPr>
+          <w:rFonts w:ascii="Times New Roman" w:hAnsi="Times New Roman" w:cs="Times New Roman"/>
+        </w:rPr>
+      </w:pPr>
+    </w:p>
+    <w:p>
+      <w:pPr>
+        <w:jc w:val="both"/>
+        <w:rPr>
+          <w:rFonts w:ascii="Times New Roman" w:hAnsi="Times New Roman" w:cs="Times New Roman"/>
+          <w:b/>
+          <w:bCs/>
+        </w:rPr>
+      </w:pPr>
+      <w:r>
+        <w:rPr>
+          <w:rFonts w:ascii="Times New Roman" w:hAnsi="Times New Roman" w:cs="Times New Roman"/>
+          <w:b/>
+          <w:bCs/>
+        </w:rPr>
+        <w:t>2.3 Graph-Based and Attention-Based Approaches</w:t>
+      </w:r>
+    </w:p>
+    <w:p>
+      <w:pPr>
+        <w:jc w:val="both"/>
+        <w:rPr>
+          <w:rFonts w:ascii="Times New Roman" w:hAnsi="Times New Roman" w:cs="Times New Roman"/>
+        </w:rPr>
+      </w:pPr>
+      <w:r>
+        <w:rPr>
+          <w:rFonts w:ascii="Times New Roman" w:hAnsi="Times New Roman" w:cs="Times New Roman"/>
+        </w:rPr>
+        <w:t>Graph-based methods have gained significant traction in recent years due to their ability to naturally represent the structural topology of the human body. Dai et al. [6] investigated the application of Graph Convolutional Networks (GCNs) for human action recognition using skeletal features. The authors concluded that GCNs are inherently more expressive than traditional vector-based methods because they naturally model the human body's graph-like structure, where joints serve as vertices and bones serve as edges. The research indicated that GCN-based models, such as the Spatial-Temporal Graph Convolutional Network (ST-GCN), achieve significant performance enhancements on large-scale datasets, reaching accuracies up to 96.2% on the NTU RGB+D dataset. The authors further suggested that GCNs provide a solid foundation for future multimodal fusion strategies in action recognition.</w:t>
+      </w:r>
+    </w:p>
+    <w:p>
+      <w:pPr>
+        <w:jc w:val="both"/>
+        <w:rPr>
+          <w:rFonts w:ascii="Times New Roman" w:hAnsi="Times New Roman" w:cs="Times New Roman"/>
+        </w:rPr>
+      </w:pPr>
+    </w:p>
+    <w:p>
+      <w:pPr>
+        <w:jc w:val="both"/>
+        <w:rPr>
+          <w:rFonts w:ascii="Times New Roman" w:hAnsi="Times New Roman" w:cs="Times New Roman"/>
+        </w:rPr>
+      </w:pPr>
+      <w:proofErr w:type="spellStart"/>
+      <w:r>
+        <w:rPr>
+          <w:rFonts w:ascii="Times New Roman" w:hAnsi="Times New Roman" w:cs="Times New Roman"/>
+        </w:rPr>
+        <w:t>Gosala</w:t>
+      </w:r>
+      <w:proofErr w:type="spellEnd"/>
+      <w:r>
+        <w:rPr>
+          <w:rFonts w:ascii="Times New Roman" w:hAnsi="Times New Roman" w:cs="Times New Roman"/>
+        </w:rPr>
+        <w:t xml:space="preserve"> et al. [9] proposed GCN-LSTM, a hybrid graph convolutional network model originally developed for schizophrenia classification from EEG signals, which demonstrated the powerful capability of combining graph-based spatial </w:t>
+      </w:r>
+      <w:proofErr w:type="spellStart"/>
+      <w:r>
+        <w:rPr>
+          <w:rFonts w:ascii="Times New Roman" w:hAnsi="Times New Roman" w:cs="Times New Roman"/>
+        </w:rPr>
         <w:t>modeling</w:t>
       </w:r>
       <w:proofErr w:type="spellEnd"/>
@@ -468,22 +842,78 @@
         <w:rPr>
           <w:rFonts w:ascii="Times New Roman" w:hAnsi="Times New Roman" w:cs="Times New Roman"/>
         </w:rPr>
-        <w:t xml:space="preserve"> sequential transitions in human motion. Beyond joint coordinates, researchers also investigated depth-sequence–based descriptors. Yang et al. introduced hypersurface normals and super-normal vectors to describe local geometric variations in depth sequences, reporting recognition rates of 98.89% for gestures and 86.25% for daily activities. </w:t>
+        <w:t xml:space="preserve"> with temporal sequence learning. The model achieved an average accuracy of 99.25% across 8-second epoch data segments. The authors concluded that the hybrid GCN-LSTM architecture successfully captures both the spatial relationships between EEG channels and the temporal evolution of signals simultaneously. The study noted that the model outperformed all compared state-of-the-art methods and suggested its potential as a valuable clinical decision-support tool.</w:t>
+      </w:r>
+    </w:p>
+    <w:p>
+      <w:pPr>
+        <w:jc w:val="both"/>
+        <w:rPr>
+          <w:rFonts w:ascii="Times New Roman" w:hAnsi="Times New Roman" w:cs="Times New Roman"/>
+        </w:rPr>
+      </w:pPr>
+    </w:p>
+    <w:p>
+      <w:pPr>
+        <w:jc w:val="both"/>
+        <w:rPr>
+          <w:rFonts w:ascii="Times New Roman" w:hAnsi="Times New Roman" w:cs="Times New Roman"/>
+          <w:b/>
+          <w:bCs/>
+        </w:rPr>
+      </w:pPr>
+      <w:r>
+        <w:rPr>
+          <w:rFonts w:ascii="Times New Roman" w:hAnsi="Times New Roman" w:cs="Times New Roman"/>
+          <w:b/>
+          <w:bCs/>
+        </w:rPr>
+        <w:t>2.4 Skeleton-Based and Kinect-Based Recognition Systems</w:t>
+      </w:r>
+    </w:p>
+    <w:p>
+      <w:pPr>
+        <w:jc w:val="both"/>
+        <w:rPr>
+          <w:rFonts w:ascii="Times New Roman" w:hAnsi="Times New Roman" w:cs="Times New Roman"/>
+        </w:rPr>
+      </w:pPr>
+      <w:r>
+        <w:rPr>
+          <w:rFonts w:ascii="Times New Roman" w:hAnsi="Times New Roman" w:cs="Times New Roman"/>
+        </w:rPr>
+        <w:t xml:space="preserve">The use of skeletal data captured from depth sensors, particularly Microsoft Kinect, has been extensively explored for human activity and gait recognition. Saini et al. [4] introduced a novel coarse-to-fine framework for continuous human activity recognition using Kinect, which segments continuous activity sequences into sitting and standing groups before performing fine-level recognition within each group. The system achieved a continuous sequence recognition rate of 68.9% and a coarse-level grouping accuracy of 93.81% using a Bidirectional LSTM neural network (BLSTM-NN). The study demonstrated that </w:t>
       </w:r>
       <w:proofErr w:type="spellStart"/>
       <w:r>
         <w:rPr>
           <w:rFonts w:ascii="Times New Roman" w:hAnsi="Times New Roman" w:cs="Times New Roman"/>
         </w:rPr>
-        <w:t>Oreifej</w:t>
+        <w:t>modeling</w:t>
       </w:r>
       <w:proofErr w:type="spellEnd"/>
       <w:r>
         <w:rPr>
           <w:rFonts w:ascii="Times New Roman" w:hAnsi="Times New Roman" w:cs="Times New Roman"/>
         </w:rPr>
-        <w:t xml:space="preserve"> et al. extended this direction with the HON4D descriptor, capturing 4D normal variations to achieve accuracy levels as high as 96.67% across diverse action and gesture datasets. Additional improvements came from studies such as </w:t>
-      </w:r>
+        <w:t xml:space="preserve"> temporal transitions between activities is essential for real-life applications and that their segmented approach significantly outperforms traditional isolated activity recognition methods.</w:t>
+      </w:r>
+    </w:p>
+    <w:p>
+      <w:pPr>
+        <w:jc w:val="both"/>
+        <w:rPr>
+          <w:rFonts w:ascii="Times New Roman" w:hAnsi="Times New Roman" w:cs="Times New Roman"/>
+        </w:rPr>
+      </w:pPr>
+    </w:p>
+    <w:p>
+      <w:pPr>
+        <w:jc w:val="both"/>
+        <w:rPr>
+          <w:rFonts w:ascii="Times New Roman" w:hAnsi="Times New Roman" w:cs="Times New Roman"/>
+        </w:rPr>
+      </w:pPr>
       <w:proofErr w:type="spellStart"/>
       <w:r>
         <w:rPr>
@@ -496,27 +926,278 @@
         <w:rPr>
           <w:rFonts w:ascii="Times New Roman" w:hAnsi="Times New Roman" w:cs="Times New Roman"/>
         </w:rPr>
-        <w:t xml:space="preserve"> and Güney, who demonstrated that using LSTMs as feature extractors—followed by an SVM classifier—can substantially improve recognition accuracy to 98.85%, compared to only 72.60% when directly classifying the raw Kinect data. Moving beyond classical HAR tasks, Kinect skeletal data has also been applied in health-related fields; for example, Wang et al. developed a gait-based depression assessment model that reached an accuracy of 93.75%, highlighting the versatility of Kinect motion data.</w:t>
-      </w:r>
-    </w:p>
-    <w:p>
-      <w:pPr>
-        <w:jc w:val="both"/>
-        <w:rPr>
-          <w:rFonts w:ascii="Times New Roman" w:hAnsi="Times New Roman" w:cs="Times New Roman"/>
-        </w:rPr>
-      </w:pPr>
-      <w:r>
-        <w:rPr>
-          <w:rFonts w:ascii="Times New Roman" w:hAnsi="Times New Roman" w:cs="Times New Roman"/>
-        </w:rPr>
-        <w:t xml:space="preserve">As HAR scenarios became more dynamic and complex, particularly continuous or unsegmented activity streams, researchers shifted to deep learning architectures capable of </w:t>
+        <w:t xml:space="preserve"> and Güney [7] investigated the classification of human movements using the Kinect sensor and concluded that joint (skeletal) data provides substantially more successful results than image data for movement classification tasks. They found that using an LSTM-based feature extractor combined with a Support Vector Machine (SVM) classifier achieved a maximum success rate of 98.85%, which was vastly superior to classical machine learning applied to raw data (72.60%) and transfer learning approaches (61.58%). The study further emphasized that elbow joints play a particularly significant role in determining movement direction and were identified as the most critical joints for accurate classification.</w:t>
+      </w:r>
+    </w:p>
+    <w:p>
+      <w:pPr>
+        <w:jc w:val="both"/>
+        <w:rPr>
+          <w:rFonts w:ascii="Times New Roman" w:hAnsi="Times New Roman" w:cs="Times New Roman"/>
+        </w:rPr>
+      </w:pPr>
+    </w:p>
+    <w:p>
+      <w:pPr>
+        <w:jc w:val="both"/>
+        <w:rPr>
+          <w:rFonts w:ascii="Times New Roman" w:hAnsi="Times New Roman" w:cs="Times New Roman"/>
+        </w:rPr>
+      </w:pPr>
+      <w:r>
+        <w:rPr>
+          <w:rFonts w:ascii="Times New Roman" w:hAnsi="Times New Roman" w:cs="Times New Roman"/>
+        </w:rPr>
+        <w:t>Reddy and Chattopadhyay [10] proposed a human activity recognition system using Kinect-captured data with a stick model representation. The authors concluded that their selective four-joint stick model, focusing on the head and shoulders, effectively reduces system complexity and noise introduced by unreliable joint estimations. The results demonstrated that combining range and mean coordinate features outperformed individual feature sets, achieving a maximum accuracy of 97.29% on their custom dataset and 94.06% on the MSR 3D Daily Activity dataset. The authors expressed their intention to integrate this system for monitoring elderly individuals in home settings.</w:t>
+      </w:r>
+    </w:p>
+    <w:p>
+      <w:pPr>
+        <w:jc w:val="both"/>
+        <w:rPr>
+          <w:rFonts w:ascii="Times New Roman" w:hAnsi="Times New Roman" w:cs="Times New Roman"/>
+        </w:rPr>
+      </w:pPr>
+    </w:p>
+    <w:p>
+      <w:pPr>
+        <w:jc w:val="both"/>
+        <w:rPr>
+          <w:rFonts w:ascii="Times New Roman" w:hAnsi="Times New Roman" w:cs="Times New Roman"/>
+        </w:rPr>
+      </w:pPr>
+      <w:r>
+        <w:rPr>
+          <w:rFonts w:ascii="Times New Roman" w:hAnsi="Times New Roman" w:cs="Times New Roman"/>
+        </w:rPr>
+        <w:t>Kumar et al. [11] addressed human activity recognition in real-time environments using skeleton joints and concluded that using only 10–12% of gesture frames is sufficient for identifying activities with excellent accuracy in real-time scenarios. Their system, utilizing Principal Component Analysis (PCA) for dimensionality reduction and Artificial Neural Networks (ANN) for classification, achieved overall accuracies ranging from 94% to 98%. The authors emphasized that speed, accuracy, and robustness are often contradictory requirements, and their approach provides a high-performance balance particularly suited for single-object recognition tasks.</w:t>
+      </w:r>
+    </w:p>
+    <w:p>
+      <w:pPr>
+        <w:jc w:val="both"/>
+        <w:rPr>
+          <w:rFonts w:ascii="Times New Roman" w:hAnsi="Times New Roman" w:cs="Times New Roman"/>
+        </w:rPr>
+      </w:pPr>
+    </w:p>
+    <w:p>
+      <w:pPr>
+        <w:jc w:val="both"/>
+        <w:rPr>
+          <w:rFonts w:ascii="Times New Roman" w:hAnsi="Times New Roman" w:cs="Times New Roman"/>
+        </w:rPr>
+      </w:pPr>
+      <w:r>
+        <w:rPr>
+          <w:rFonts w:ascii="Times New Roman" w:hAnsi="Times New Roman" w:cs="Times New Roman"/>
+        </w:rPr>
+        <w:t>Komang et al. [13] explored human activity recognition using skeleton data and support vector machines. The authors concluded that the distance of the subject from the sensor significantly impacts recognition accuracy. Their SVM-based system achieved its highest average accuracy of 93.75% when the subject was positioned at 2 meters from the Kinect sensor. The study introduced a multi-class SVM with a radial basis function (RBF) kernel, which provided accurate results for eight specific indoor and standing activities.</w:t>
+      </w:r>
+    </w:p>
+    <w:p>
+      <w:pPr>
+        <w:jc w:val="both"/>
+        <w:rPr>
+          <w:rFonts w:ascii="Times New Roman" w:hAnsi="Times New Roman" w:cs="Times New Roman"/>
+        </w:rPr>
+      </w:pPr>
+    </w:p>
+    <w:p>
+      <w:pPr>
+        <w:jc w:val="both"/>
+        <w:rPr>
+          <w:rFonts w:ascii="Times New Roman" w:hAnsi="Times New Roman" w:cs="Times New Roman"/>
+        </w:rPr>
+      </w:pPr>
+      <w:r>
+        <w:rPr>
+          <w:rFonts w:ascii="Times New Roman" w:hAnsi="Times New Roman" w:cs="Times New Roman"/>
+        </w:rPr>
+        <w:t xml:space="preserve">Ashwini et al. [19] developed a skeletal data-based activity recognition system and concluded that SVM is a more effective classifier than K-Nearest </w:t>
       </w:r>
       <w:proofErr w:type="spellStart"/>
       <w:r>
         <w:rPr>
           <w:rFonts w:ascii="Times New Roman" w:hAnsi="Times New Roman" w:cs="Times New Roman"/>
         </w:rPr>
+        <w:t>Neighbors</w:t>
+      </w:r>
+      <w:proofErr w:type="spellEnd"/>
+      <w:r>
+        <w:rPr>
+          <w:rFonts w:ascii="Times New Roman" w:hAnsi="Times New Roman" w:cs="Times New Roman"/>
+        </w:rPr>
+        <w:t xml:space="preserve"> (KNN) for three-dimensional skeletal data on the KARD dataset. The SVM classifier achieved an average overall accuracy of 98%, which was 3.5% higher than KNN. They reported that sensitivity reached 100% for </w:t>
+      </w:r>
+      <w:r>
+        <w:rPr>
+          <w:rFonts w:ascii="Times New Roman" w:hAnsi="Times New Roman" w:cs="Times New Roman"/>
+        </w:rPr>
+        <w:lastRenderedPageBreak/>
+        <w:t>certain actions, demonstrating that dimensionally reduced features obtained via PCA can still provide highly accurate activity identification.</w:t>
+      </w:r>
+    </w:p>
+    <w:p>
+      <w:pPr>
+        <w:jc w:val="both"/>
+        <w:rPr>
+          <w:rFonts w:ascii="Times New Roman" w:hAnsi="Times New Roman" w:cs="Times New Roman"/>
+        </w:rPr>
+      </w:pPr>
+    </w:p>
+    <w:p>
+      <w:pPr>
+        <w:jc w:val="both"/>
+        <w:rPr>
+          <w:rFonts w:ascii="Times New Roman" w:hAnsi="Times New Roman" w:cs="Times New Roman"/>
+        </w:rPr>
+      </w:pPr>
+      <w:r>
+        <w:rPr>
+          <w:rFonts w:ascii="Times New Roman" w:hAnsi="Times New Roman" w:cs="Times New Roman"/>
+        </w:rPr>
+        <w:t>Yadav et al.</w:t>
+      </w:r>
+      <w:r>
+        <w:rPr>
+          <w:rFonts w:ascii="Times New Roman" w:hAnsi="Times New Roman" w:cs="Times New Roman"/>
+        </w:rPr>
+        <w:t xml:space="preserve"> [35]</w:t>
+      </w:r>
+      <w:r>
+        <w:rPr>
+          <w:rFonts w:ascii="Times New Roman" w:hAnsi="Times New Roman" w:cs="Times New Roman"/>
+        </w:rPr>
+        <w:t xml:space="preserve"> investigated skeleton-based human activity recognition using </w:t>
+      </w:r>
+      <w:proofErr w:type="spellStart"/>
+      <w:r>
+        <w:rPr>
+          <w:rFonts w:ascii="Times New Roman" w:hAnsi="Times New Roman" w:cs="Times New Roman"/>
+        </w:rPr>
+        <w:t>ConvLSTM</w:t>
+      </w:r>
+      <w:proofErr w:type="spellEnd"/>
+      <w:r>
+        <w:rPr>
+          <w:rFonts w:ascii="Times New Roman" w:hAnsi="Times New Roman" w:cs="Times New Roman"/>
+        </w:rPr>
+        <w:t xml:space="preserve"> and guided feature learning. The authors concluded that the sequential fusion of CNN and LSTM networks is superior to isolated or parallel model configurations, as it captures the optimal set of spatiotemporal features from skeleton-based data. Their </w:t>
+      </w:r>
+      <w:proofErr w:type="spellStart"/>
+      <w:r>
+        <w:rPr>
+          <w:rFonts w:ascii="Times New Roman" w:hAnsi="Times New Roman" w:cs="Times New Roman"/>
+        </w:rPr>
+        <w:t>ConvLSTM</w:t>
+      </w:r>
+      <w:proofErr w:type="spellEnd"/>
+      <w:r>
+        <w:rPr>
+          <w:rFonts w:ascii="Times New Roman" w:hAnsi="Times New Roman" w:cs="Times New Roman"/>
+        </w:rPr>
+        <w:t xml:space="preserve"> model achieved 98.89% accuracy, which represented a 5–6% improvement over individual CNN (93.89%) or LSTM (92.75%) networks. The derived "guided features" effectively preserved user privacy while remaining independent of camera orientation or clothing variations.</w:t>
+      </w:r>
+    </w:p>
+    <w:p>
+      <w:pPr>
+        <w:jc w:val="both"/>
+        <w:rPr>
+          <w:rFonts w:ascii="Times New Roman" w:hAnsi="Times New Roman" w:cs="Times New Roman"/>
+        </w:rPr>
+      </w:pPr>
+    </w:p>
+    <w:p>
+      <w:pPr>
+        <w:jc w:val="both"/>
+        <w:rPr>
+          <w:rFonts w:ascii="Times New Roman" w:hAnsi="Times New Roman" w:cs="Times New Roman"/>
+          <w:b/>
+          <w:bCs/>
+        </w:rPr>
+      </w:pPr>
+      <w:r>
+        <w:rPr>
+          <w:rFonts w:ascii="Times New Roman" w:hAnsi="Times New Roman" w:cs="Times New Roman"/>
+          <w:b/>
+          <w:bCs/>
+        </w:rPr>
+        <w:t xml:space="preserve">2.5 Gait Recognition and </w:t>
+      </w:r>
+      <w:proofErr w:type="spellStart"/>
+      <w:r>
+        <w:rPr>
+          <w:rFonts w:ascii="Times New Roman" w:hAnsi="Times New Roman" w:cs="Times New Roman"/>
+          <w:b/>
+          <w:bCs/>
+        </w:rPr>
+        <w:t>Modeling</w:t>
+      </w:r>
+      <w:proofErr w:type="spellEnd"/>
+    </w:p>
+    <w:p>
+      <w:pPr>
+        <w:jc w:val="both"/>
+        <w:rPr>
+          <w:rFonts w:ascii="Times New Roman" w:hAnsi="Times New Roman" w:cs="Times New Roman"/>
+        </w:rPr>
+      </w:pPr>
+      <w:r>
+        <w:rPr>
+          <w:rFonts w:ascii="Times New Roman" w:hAnsi="Times New Roman" w:cs="Times New Roman"/>
+        </w:rPr>
+        <w:t xml:space="preserve">Gait analysis constitutes another closely related area of research that has been studied extensively in the context of human motion understanding. Bari and Gavrilova [15] proposed </w:t>
+      </w:r>
+      <w:proofErr w:type="spellStart"/>
+      <w:r>
+        <w:rPr>
+          <w:rFonts w:ascii="Times New Roman" w:hAnsi="Times New Roman" w:cs="Times New Roman"/>
+        </w:rPr>
+        <w:t>KinectGaitNet</w:t>
+      </w:r>
+      <w:proofErr w:type="spellEnd"/>
+      <w:r>
+        <w:rPr>
+          <w:rFonts w:ascii="Times New Roman" w:hAnsi="Times New Roman" w:cs="Times New Roman"/>
+        </w:rPr>
+        <w:t>, a Kinect-based gait recognition system using deep convolutional neural networks. The authors concluded that their system can accurately identify individuals using residual learning-based CNNs without requiring resampling of the gait cycle. The model achieved a rank-1 recognition accuracy of 99.33% on the KGB dataset and 96.91% on the UPCV dataset. They determined that Global Average Pooling (GAP) is the most effective pooling method for handling variable-dimensional feature maps in gait recognition tasks.</w:t>
+      </w:r>
+    </w:p>
+    <w:p>
+      <w:pPr>
+        <w:jc w:val="both"/>
+        <w:rPr>
+          <w:rFonts w:ascii="Times New Roman" w:hAnsi="Times New Roman" w:cs="Times New Roman"/>
+        </w:rPr>
+      </w:pPr>
+    </w:p>
+    <w:p>
+      <w:pPr>
+        <w:jc w:val="both"/>
+        <w:rPr>
+          <w:rFonts w:ascii="Times New Roman" w:hAnsi="Times New Roman" w:cs="Times New Roman"/>
+        </w:rPr>
+      </w:pPr>
+      <w:proofErr w:type="spellStart"/>
+      <w:r>
+        <w:rPr>
+          <w:rFonts w:ascii="Times New Roman" w:hAnsi="Times New Roman" w:cs="Times New Roman"/>
+        </w:rPr>
+        <w:t>Abhayasinghe</w:t>
+      </w:r>
+      <w:proofErr w:type="spellEnd"/>
+      <w:r>
+        <w:rPr>
+          <w:rFonts w:ascii="Times New Roman" w:hAnsi="Times New Roman" w:cs="Times New Roman"/>
+        </w:rPr>
+        <w:t xml:space="preserve"> and Murray [12] investigated human gait </w:t>
+      </w:r>
+      <w:proofErr w:type="spellStart"/>
+      <w:r>
+        <w:rPr>
+          <w:rFonts w:ascii="Times New Roman" w:hAnsi="Times New Roman" w:cs="Times New Roman"/>
+        </w:rPr>
         <w:t>modeling</w:t>
       </w:r>
       <w:proofErr w:type="spellEnd"/>
@@ -524,182 +1205,110 @@
         <w:rPr>
           <w:rFonts w:ascii="Times New Roman" w:hAnsi="Times New Roman" w:cs="Times New Roman"/>
         </w:rPr>
-        <w:t xml:space="preserve"> both spatial patterns and long-range temporal dependencies. Saini et al. proposed a Coarse-to-Fine framework that relies on Bidirectional LSTMs to model forward and backward temporal relationships without requiring pre-segmentation. Their system achieved a sequence recognition rate of 68.9%, which is notable given the difficulty of continuous HAR. In another major contribution, Sain and colleagues introduced a hybrid CNN–</w:t>
+        <w:t xml:space="preserve">, prediction, and classification for level walking using harmonic models derived from a single thigh-mounted IMU. The authors concluded that human gait phases can be accurately </w:t>
       </w:r>
       <w:proofErr w:type="spellStart"/>
       <w:r>
         <w:rPr>
           <w:rFonts w:ascii="Times New Roman" w:hAnsi="Times New Roman" w:cs="Times New Roman"/>
         </w:rPr>
-        <w:t>BiLSTM</w:t>
+        <w:t>modeled</w:t>
       </w:r>
       <w:proofErr w:type="spellEnd"/>
       <w:r>
         <w:rPr>
           <w:rFonts w:ascii="Times New Roman" w:hAnsi="Times New Roman" w:cs="Times New Roman"/>
         </w:rPr>
-        <w:t xml:space="preserve"> framework using Kinect V2 skeleton data enriched with kinematic attributes such as joint velocities and angles. Their approach achieved 99.5% accuracy on the LNMIIT-KHAD dataset—substantially outperforming CNN-only (95.76%) and </w:t>
-      </w:r>
-      <w:proofErr w:type="spellStart"/>
-      <w:r>
-        <w:rPr>
-          <w:rFonts w:ascii="Times New Roman" w:hAnsi="Times New Roman" w:cs="Times New Roman"/>
-        </w:rPr>
-        <w:t>ConvLSTM</w:t>
-      </w:r>
-      <w:proofErr w:type="spellEnd"/>
-      <w:r>
-        <w:rPr>
-          <w:rFonts w:ascii="Times New Roman" w:hAnsi="Times New Roman" w:cs="Times New Roman"/>
-        </w:rPr>
-        <w:t xml:space="preserve"> (98.89%) baselines—demonstrating the benefits of combining spatial convolution with bidirectional recurrent </w:t>
-      </w:r>
-      <w:proofErr w:type="spellStart"/>
-      <w:r>
-        <w:rPr>
-          <w:rFonts w:ascii="Times New Roman" w:hAnsi="Times New Roman" w:cs="Times New Roman"/>
-        </w:rPr>
-        <w:t>modeling</w:t>
-      </w:r>
-      <w:proofErr w:type="spellEnd"/>
-      <w:r>
-        <w:rPr>
-          <w:rFonts w:ascii="Times New Roman" w:hAnsi="Times New Roman" w:cs="Times New Roman"/>
-        </w:rPr>
-        <w:t xml:space="preserve">. Further improvements were documented by Gupta et al., whose SDL-Net architecture fused CNN and RNN components while using Part Affinity Fields to generate structured skeletal representations. This model produced high performance on the Kinect Activity Recognition Dataset. Popescu et al. pushed multimodality further by employing 3D CNNs to jointly process RGB frames, depth information, skeletal coordinates, and object context, achieving strong results on widely used datasets such as MSRDailyActivity3D and NTU RGB+D. In the domain </w:t>
-      </w:r>
+        <w:t xml:space="preserve"> and classified using harmonic models extracted from a single inertial sensor. They observed that normalized overtone amplitudes are generally smaller for males than females in their sample population, although phase characteristics remain comparable across genders. The research provided a successful framework for predicting gait patterns in natural, unconstrained environments.</w:t>
+      </w:r>
+    </w:p>
+    <w:p>
+      <w:pPr>
+        <w:jc w:val="both"/>
+        <w:rPr>
+          <w:rFonts w:ascii="Times New Roman" w:hAnsi="Times New Roman" w:cs="Times New Roman"/>
+        </w:rPr>
+      </w:pPr>
+    </w:p>
+    <w:p>
+      <w:pPr>
+        <w:jc w:val="both"/>
+        <w:rPr>
+          <w:rFonts w:ascii="Times New Roman" w:hAnsi="Times New Roman" w:cs="Times New Roman"/>
+        </w:rPr>
+      </w:pPr>
+      <w:r>
+        <w:rPr>
+          <w:rFonts w:ascii="Times New Roman" w:hAnsi="Times New Roman" w:cs="Times New Roman"/>
+        </w:rPr>
+        <w:t>Qin et al. [18] investigated human gait prediction and recognition algorithms for lower limb-assisted exoskeleton robots. The researchers concluded that combining fuzzy inference with least-squares support vector regression (LS-SVR) significantly reduces system delay in gait phase detection. The results demonstrated high accuracy in gait data prediction, reaching 99.93% for specific pressure sensor configurations. The proposed algorithm effectively recognizes four specific gait phases—heel landing, full foot landing, heel off-ground, and toe off-ground—enabling smoother and more natural exoskeleton assistance.</w:t>
+      </w:r>
+    </w:p>
+    <w:p>
+      <w:pPr>
+        <w:jc w:val="both"/>
+        <w:rPr>
+          <w:rFonts w:ascii="Times New Roman" w:hAnsi="Times New Roman" w:cs="Times New Roman"/>
+        </w:rPr>
+      </w:pPr>
+    </w:p>
+    <w:p>
+      <w:pPr>
+        <w:jc w:val="both"/>
+        <w:rPr>
+          <w:rFonts w:ascii="Times New Roman" w:hAnsi="Times New Roman" w:cs="Times New Roman"/>
+          <w:b/>
+          <w:bCs/>
+        </w:rPr>
+      </w:pPr>
+      <w:r>
+        <w:rPr>
+          <w:rFonts w:ascii="Times New Roman" w:hAnsi="Times New Roman" w:cs="Times New Roman"/>
+          <w:b/>
+          <w:bCs/>
+        </w:rPr>
+        <w:t>2.6 Multi-Scale and Residual Learning Approaches</w:t>
+      </w:r>
+    </w:p>
+    <w:p>
+      <w:pPr>
+        <w:jc w:val="both"/>
+        <w:rPr>
+          <w:rFonts w:ascii="Times New Roman" w:hAnsi="Times New Roman" w:cs="Times New Roman"/>
+        </w:rPr>
+      </w:pPr>
       <w:r>
         <w:rPr>
           <w:rFonts w:ascii="Times New Roman" w:hAnsi="Times New Roman" w:cs="Times New Roman"/>
         </w:rPr>
         <w:lastRenderedPageBreak/>
-        <w:t xml:space="preserve">of gait recognition, </w:t>
-      </w:r>
-      <w:proofErr w:type="spellStart"/>
-      <w:r>
-        <w:rPr>
-          <w:rFonts w:ascii="Times New Roman" w:hAnsi="Times New Roman" w:cs="Times New Roman"/>
-        </w:rPr>
-        <w:t>Kaseris</w:t>
-      </w:r>
-      <w:proofErr w:type="spellEnd"/>
-      <w:r>
-        <w:rPr>
-          <w:rFonts w:ascii="Times New Roman" w:hAnsi="Times New Roman" w:cs="Times New Roman"/>
-        </w:rPr>
-        <w:t xml:space="preserve"> et al. introduced </w:t>
-      </w:r>
-      <w:proofErr w:type="spellStart"/>
-      <w:r>
-        <w:rPr>
-          <w:rFonts w:ascii="Times New Roman" w:hAnsi="Times New Roman" w:cs="Times New Roman"/>
-        </w:rPr>
-        <w:t>KinectGaitNet</w:t>
-      </w:r>
-      <w:proofErr w:type="spellEnd"/>
-      <w:r>
-        <w:rPr>
-          <w:rFonts w:ascii="Times New Roman" w:hAnsi="Times New Roman" w:cs="Times New Roman"/>
-        </w:rPr>
-        <w:t>, a residual CNN architecture that constructs 3D gait matrices without resampling the gait cycle, achieving 96.91% accuracy on UPCV and 99.33% on KGB, outperforming earlier methods including the 95.30% accuracy reported by Bari and Gavrilova.</w:t>
-      </w:r>
-    </w:p>
-    <w:p>
-      <w:pPr>
-        <w:jc w:val="both"/>
-        <w:rPr>
-          <w:rFonts w:ascii="Times New Roman" w:hAnsi="Times New Roman" w:cs="Times New Roman"/>
-        </w:rPr>
-      </w:pPr>
-      <w:r>
-        <w:rPr>
-          <w:rFonts w:ascii="Times New Roman" w:hAnsi="Times New Roman" w:cs="Times New Roman"/>
-        </w:rPr>
-        <w:t xml:space="preserve">Parallel to Kinect-based research, the broader HAR community has increasingly explored multi-scale architectures, residual skip pathways, and attention mechanisms—concepts that directly inform modern skeletal-based recurrent models. Challa et al. demonstrated that parallel convolutional branches with varying kernel widths can effectively capture multi-scale temporal dependencies, achieving over 94% accuracy across benchmark wearable-sensor datasets such as UCI-HAR, WISDM, and PAMAP2. Thakur et al. proposed the </w:t>
-      </w:r>
-      <w:proofErr w:type="spellStart"/>
-      <w:r>
-        <w:rPr>
-          <w:rFonts w:ascii="Times New Roman" w:hAnsi="Times New Roman" w:cs="Times New Roman"/>
-        </w:rPr>
-        <w:t>ConvAE</w:t>
-      </w:r>
-      <w:proofErr w:type="spellEnd"/>
-      <w:r>
-        <w:rPr>
-          <w:rFonts w:ascii="Times New Roman" w:hAnsi="Times New Roman" w:cs="Times New Roman"/>
-        </w:rPr>
-        <w:t xml:space="preserve">-LSTM model, combining convolutional encoding, autoencoder-based representation learning, and LSTM-based temporal </w:t>
-      </w:r>
-      <w:proofErr w:type="spellStart"/>
-      <w:r>
-        <w:rPr>
-          <w:rFonts w:ascii="Times New Roman" w:hAnsi="Times New Roman" w:cs="Times New Roman"/>
-        </w:rPr>
-        <w:t>modeling</w:t>
-      </w:r>
-      <w:proofErr w:type="spellEnd"/>
-      <w:r>
-        <w:rPr>
-          <w:rFonts w:ascii="Times New Roman" w:hAnsi="Times New Roman" w:cs="Times New Roman"/>
-        </w:rPr>
-        <w:t>. Their system achieved 98.67% on WISDM and 97.13% on UCI-HAR, reinforcing the value of hierarchical feature processing. Khatun et al. further enhanced HAR performance by integrating self-attention into a CNN–LSTM hybrid, achieving state-of-the-art accuracy of 99.93% on the H-Activity dataset. Zhao et al. addressed the issue of gradient decay in long sequences by introducing a Deep Residual Bidirectional LSTM architecture, which achieved 93.6% on UCI and OPPORTUNITY, demonstrating that residual skip pathways are crucial for stabilizing deep recurrent networks.</w:t>
-      </w:r>
-    </w:p>
-    <w:p>
-      <w:pPr>
-        <w:jc w:val="both"/>
-        <w:rPr>
-          <w:rFonts w:ascii="Times New Roman" w:hAnsi="Times New Roman" w:cs="Times New Roman"/>
-        </w:rPr>
-      </w:pPr>
-      <w:r>
-        <w:rPr>
-          <w:rFonts w:ascii="Times New Roman" w:hAnsi="Times New Roman" w:cs="Times New Roman"/>
-        </w:rPr>
-        <w:t xml:space="preserve">Beyond visual and skeletal approaches, several device-free HAR methods have emerged that utilize ambient signals rather than cameras. Wi-Fi-based HAR has grown rapidly due to its ubiquity and privacy-preserving characteristics. </w:t>
-      </w:r>
-      <w:proofErr w:type="spellStart"/>
-      <w:r>
-        <w:rPr>
-          <w:rFonts w:ascii="Times New Roman" w:hAnsi="Times New Roman" w:cs="Times New Roman"/>
-        </w:rPr>
-        <w:t>Salehinejad</w:t>
-      </w:r>
-      <w:proofErr w:type="spellEnd"/>
-      <w:r>
-        <w:rPr>
-          <w:rFonts w:ascii="Times New Roman" w:hAnsi="Times New Roman" w:cs="Times New Roman"/>
-        </w:rPr>
-        <w:t xml:space="preserve"> et al. showed that CNNs applied to Channel State Information can simultaneously classify activity and orientation, achieving high performance on self-collected data. Zhang et al. demonstrated that Dense-LSTM architectures combined with data augmentation significantly improve recognition robustness in Wi-Fi environments. Radar-based HAR provides another compelling alternative, especially due to its ability to penetrate obstacles and operate in low-light conditions. Xiang et al. used 2DPCA for feature reduction in FMCW radar images followed by </w:t>
-      </w:r>
-      <w:proofErr w:type="spellStart"/>
-      <w:r>
-        <w:rPr>
-          <w:rFonts w:ascii="Times New Roman" w:hAnsi="Times New Roman" w:cs="Times New Roman"/>
-        </w:rPr>
-        <w:t>kNN</w:t>
-      </w:r>
-      <w:proofErr w:type="spellEnd"/>
-      <w:r>
-        <w:rPr>
-          <w:rFonts w:ascii="Times New Roman" w:hAnsi="Times New Roman" w:cs="Times New Roman"/>
-        </w:rPr>
-        <w:t xml:space="preserve"> classification, achieving high recognition accuracy on the University of Glasgow dataset. More recently, Guo et al. explored the use of Point Transformer architectures for </w:t>
-      </w:r>
-      <w:proofErr w:type="spellStart"/>
-      <w:r>
-        <w:rPr>
-          <w:rFonts w:ascii="Times New Roman" w:hAnsi="Times New Roman" w:cs="Times New Roman"/>
-        </w:rPr>
-        <w:t>analyzing</w:t>
-      </w:r>
-      <w:proofErr w:type="spellEnd"/>
-      <w:r>
-        <w:rPr>
-          <w:rFonts w:ascii="Times New Roman" w:hAnsi="Times New Roman" w:cs="Times New Roman"/>
-        </w:rPr>
-        <w:t xml:space="preserve"> 4D radar point clouds and reported strong performance in classifying Activities of Daily Living.</w:t>
+        <w:t>Guo et al. [16] proposed MRC-LSTM, a hybrid approach combining multi-scale residual CNN and LSTM networks for Bitcoin price prediction. Although the application domain differs from HAR, the underlying architectural principle of utilizing multi-scale residual blocks to extract rich features across multiple temporal scales is directly relevant to activity recognition. The authors concluded that the multi-scale residual block effectively strengthens the representational ability of the feature extraction pipeline. The MRC-LSTM model achieved the lowest prediction error, with a mean absolute error (MAE) of 166.52 compared to isolated CNN, LSTM, or MLP models. The empirical results further confirmed the model's strong generalization ability to predict short-term trends for other time-series data.</w:t>
+      </w:r>
+    </w:p>
+    <w:p>
+      <w:pPr>
+        <w:jc w:val="both"/>
+        <w:rPr>
+          <w:rFonts w:ascii="Times New Roman" w:hAnsi="Times New Roman" w:cs="Times New Roman"/>
+        </w:rPr>
+      </w:pPr>
+    </w:p>
+    <w:p>
+      <w:pPr>
+        <w:jc w:val="both"/>
+        <w:rPr>
+          <w:rFonts w:ascii="Times New Roman" w:hAnsi="Times New Roman" w:cs="Times New Roman"/>
+          <w:b/>
+          <w:bCs/>
+        </w:rPr>
+      </w:pPr>
+      <w:r>
+        <w:rPr>
+          <w:rFonts w:ascii="Times New Roman" w:hAnsi="Times New Roman" w:cs="Times New Roman"/>
+          <w:b/>
+          <w:bCs/>
+        </w:rPr>
+        <w:t>2.7 Summary and Research Gaps</w:t>
       </w:r>
     </w:p>
     <w:p>
@@ -713,6 +1322,40 @@
           <w:szCs w:val="28"/>
         </w:rPr>
       </w:pPr>
+      <w:r>
+        <w:rPr>
+          <w:rFonts w:ascii="Times New Roman" w:hAnsi="Times New Roman" w:cs="Times New Roman"/>
+        </w:rPr>
+        <w:t xml:space="preserve">The reviewed literature demonstrates substantial progress in human activity recognition across multiple modalities and architectures. However, several research gaps remain. First, many existing skeleton-based models rely on conventional feature engineering or isolated deep learning architectures that do not fully exploit both the spatial topology and temporal dynamics of skeletal sequences simultaneously. Second, while GCN-based methods effectively capture structural relationships, they are often computationally expensive and may not integrate seamlessly with temporal sequence models. Third, most existing hybrid models have not incorporated multi-scale residual learning with graph-based spatial </w:t>
+      </w:r>
+      <w:proofErr w:type="spellStart"/>
+      <w:r>
+        <w:rPr>
+          <w:rFonts w:ascii="Times New Roman" w:hAnsi="Times New Roman" w:cs="Times New Roman"/>
+        </w:rPr>
+        <w:t>modeling</w:t>
+      </w:r>
+      <w:proofErr w:type="spellEnd"/>
+      <w:r>
+        <w:rPr>
+          <w:rFonts w:ascii="Times New Roman" w:hAnsi="Times New Roman" w:cs="Times New Roman"/>
+        </w:rPr>
+        <w:t xml:space="preserve"> and bidirectional temporal encoding in a unified framework. The present study addresses these gaps by proposing an integrated architecture that synergistically combines multi-scale residual feature extraction, graph convolutional spatial </w:t>
+      </w:r>
+      <w:proofErr w:type="spellStart"/>
+      <w:r>
+        <w:rPr>
+          <w:rFonts w:ascii="Times New Roman" w:hAnsi="Times New Roman" w:cs="Times New Roman"/>
+        </w:rPr>
+        <w:t>modeling</w:t>
+      </w:r>
+      <w:proofErr w:type="spellEnd"/>
+      <w:r>
+        <w:rPr>
+          <w:rFonts w:ascii="Times New Roman" w:hAnsi="Times New Roman" w:cs="Times New Roman"/>
+        </w:rPr>
+        <w:t>, and bidirectional LSTM-based temporal encoding for robust and accurate human activity recognition from Kinect skeletal data.</w:t>
+      </w:r>
     </w:p>
     <w:p>
       <w:pPr>
@@ -865,14 +1508,7 @@
         <w:rPr>
           <w:rFonts w:ascii="Times New Roman" w:hAnsi="Times New Roman" w:cs="Times New Roman"/>
         </w:rPr>
-        <w:t xml:space="preserve"> of human activities. Data were collected from multiple </w:t>
-      </w:r>
-      <w:r>
-        <w:rPr>
-          <w:rFonts w:ascii="Times New Roman" w:hAnsi="Times New Roman" w:cs="Times New Roman"/>
-        </w:rPr>
-        <w:lastRenderedPageBreak/>
-        <w:t>participants performing a diverse set of everyday activities, enabling detailed analysis of both posture and motion dynamics.</w:t>
+        <w:t xml:space="preserve"> of human activities. Data were collected from multiple participants performing a diverse set of everyday activities, enabling detailed analysis of both posture and motion dynamics.</w:t>
       </w:r>
     </w:p>
     <w:p>
@@ -1014,6 +1650,7 @@
         <w:rPr>
           <w:rFonts w:ascii="Times New Roman" w:hAnsi="Times New Roman" w:cs="Times New Roman"/>
         </w:rPr>
+        <w:lastRenderedPageBreak/>
         <w:t>Temporal Coverage: Sufficient duration to capture meaningful movement patterns.</w:t>
       </w:r>
     </w:p>
@@ -2120,7 +2757,6 @@
           <w:sz w:val="28"/>
           <w:szCs w:val="28"/>
         </w:rPr>
-        <w:lastRenderedPageBreak/>
         <w:t>B.</w:t>
       </w:r>
       <w:r>
@@ -2263,6 +2899,7 @@
         <w:rPr>
           <w:rFonts w:ascii="Times New Roman" w:hAnsi="Times New Roman" w:cs="Times New Roman"/>
         </w:rPr>
+        <w:lastRenderedPageBreak/>
         <w:t>ShoulderRight</w:t>
       </w:r>
       <w:proofErr w:type="spellEnd"/>
@@ -2382,7 +3019,21 @@
         <w:rPr>
           <w:rFonts w:ascii="Times New Roman" w:hAnsi="Times New Roman" w:cs="Times New Roman"/>
         </w:rPr>
-        <w:t xml:space="preserve">, KneeRight, </w:t>
+        <w:t xml:space="preserve">, </w:t>
+      </w:r>
+      <w:proofErr w:type="spellStart"/>
+      <w:r>
+        <w:rPr>
+          <w:rFonts w:ascii="Times New Roman" w:hAnsi="Times New Roman" w:cs="Times New Roman"/>
+        </w:rPr>
+        <w:t>KneeRight</w:t>
+      </w:r>
+      <w:proofErr w:type="spellEnd"/>
+      <w:r>
+        <w:rPr>
+          <w:rFonts w:ascii="Times New Roman" w:hAnsi="Times New Roman" w:cs="Times New Roman"/>
+        </w:rPr>
+        <w:t xml:space="preserve">, </w:t>
       </w:r>
       <w:proofErr w:type="spellStart"/>
       <w:r>
@@ -2662,15 +3313,7 @@
           <w:b/>
           <w:bCs/>
         </w:rPr>
-        <w:t xml:space="preserve"> </w:t>
-      </w:r>
-      <w:r>
-        <w:rPr>
-          <w:rFonts w:ascii="Times New Roman" w:hAnsi="Times New Roman" w:cs="Times New Roman"/>
-          <w:b/>
-          <w:bCs/>
-        </w:rPr>
-        <w:t>Skeletal Joint Representation</w:t>
+        <w:t xml:space="preserve"> Skeletal Joint Representation</w:t>
       </w:r>
     </w:p>
     <w:p>
@@ -2726,136 +3369,234 @@
         <w:rPr>
           <w:rFonts w:ascii="Times New Roman" w:hAnsi="Times New Roman" w:cs="Times New Roman"/>
         </w:rPr>
-        <w:t xml:space="preserve">The dataset is organized hierarchically, with a dedicated folder for each participant. Within each folder, separate CSV files correspond to the seven recorded activities: bending, jumping, running, sitting, squat, standing, and walking. Each file contains time-stamped 3D coordinates </w:t>
-      </w:r>
-      <w:r>
-        <w:rPr>
-          <w:rFonts w:ascii="Times New Roman" w:hAnsi="Times New Roman" w:cs="Times New Roman"/>
+        <w:t>The dataset is organized hierarchically, with a dedicated folder for each participant. Within each folder, separate CSV files correspond to the seven recorded activities: bending, jumping, running, sitting, squat, standing, and walking. Each file contains time-stamped 3D coordinates for all 25 joints, providing a complete representation of the participant’s motion for the respective activity.</w:t>
+      </w:r>
+    </w:p>
+    <w:p>
+      <w:pPr>
+        <w:jc w:val="both"/>
+        <w:rPr>
+          <w:rFonts w:ascii="Times New Roman" w:hAnsi="Times New Roman" w:cs="Times New Roman"/>
+        </w:rPr>
+      </w:pPr>
+      <w:r>
+        <w:rPr>
+          <w:rFonts w:ascii="Times New Roman" w:hAnsi="Times New Roman" w:cs="Times New Roman"/>
+        </w:rPr>
+        <w:t xml:space="preserve">Participant diversity in terms of body structure, height, weight, and age ensures that the dataset captures natural variations in movement patterns. This heterogeneity enhances the generalizability of models trained on the dataset, reflecting realistic population variability. The structured format simplifies access, processing, and analysis of skeletal data, supporting both spatial and temporal </w:t>
+      </w:r>
+      <w:proofErr w:type="spellStart"/>
+      <w:r>
+        <w:rPr>
+          <w:rFonts w:ascii="Times New Roman" w:hAnsi="Times New Roman" w:cs="Times New Roman"/>
+        </w:rPr>
+        <w:t>modeling</w:t>
+      </w:r>
+      <w:proofErr w:type="spellEnd"/>
+      <w:r>
+        <w:rPr>
+          <w:rFonts w:ascii="Times New Roman" w:hAnsi="Times New Roman" w:cs="Times New Roman"/>
+        </w:rPr>
+        <w:t xml:space="preserve"> of human motion.</w:t>
+      </w:r>
+    </w:p>
+    <w:p>
+      <w:pPr>
+        <w:jc w:val="both"/>
+        <w:rPr>
+          <w:rFonts w:ascii="Times New Roman" w:hAnsi="Times New Roman" w:cs="Times New Roman"/>
+        </w:rPr>
+      </w:pPr>
+    </w:p>
+    <w:p>
+      <w:pPr>
+        <w:jc w:val="both"/>
+        <w:rPr>
+          <w:rFonts w:ascii="Times New Roman" w:hAnsi="Times New Roman" w:cs="Times New Roman"/>
+          <w:b/>
+          <w:bCs/>
+        </w:rPr>
+      </w:pPr>
+      <w:r>
+        <w:rPr>
+          <w:rFonts w:ascii="Times New Roman" w:hAnsi="Times New Roman" w:cs="Times New Roman"/>
+          <w:b/>
+          <w:bCs/>
         </w:rPr>
         <w:lastRenderedPageBreak/>
-        <w:t>for all 25 joints, providing a complete representation of the participant’s motion for the respective activity.</w:t>
-      </w:r>
-    </w:p>
-    <w:p>
-      <w:pPr>
-        <w:jc w:val="both"/>
-        <w:rPr>
-          <w:rFonts w:ascii="Times New Roman" w:hAnsi="Times New Roman" w:cs="Times New Roman"/>
-        </w:rPr>
-      </w:pPr>
-      <w:r>
-        <w:rPr>
-          <w:rFonts w:ascii="Times New Roman" w:hAnsi="Times New Roman" w:cs="Times New Roman"/>
-        </w:rPr>
-        <w:t xml:space="preserve">Participant diversity in terms of body structure, height, weight, and age ensures that the dataset captures natural variations in movement patterns. This heterogeneity enhances the generalizability of models trained on the dataset, reflecting realistic population variability. The structured format simplifies access, processing, and analysis of skeletal data, supporting both spatial and temporal </w:t>
+        <w:t>3.</w:t>
+      </w:r>
+      <w:r>
+        <w:rPr>
+          <w:rFonts w:ascii="Times New Roman" w:hAnsi="Times New Roman" w:cs="Times New Roman"/>
+          <w:b/>
+          <w:bCs/>
+        </w:rPr>
+        <w:t>1.2</w:t>
+      </w:r>
+      <w:r>
+        <w:rPr>
+          <w:rFonts w:ascii="Times New Roman" w:hAnsi="Times New Roman" w:cs="Times New Roman"/>
+          <w:b/>
+          <w:bCs/>
+        </w:rPr>
+        <w:t xml:space="preserve"> KARD Dataset Description</w:t>
+      </w:r>
+    </w:p>
+    <w:p>
+      <w:pPr>
+        <w:jc w:val="both"/>
+        <w:rPr>
+          <w:rFonts w:ascii="Times New Roman" w:hAnsi="Times New Roman" w:cs="Times New Roman"/>
+        </w:rPr>
+      </w:pPr>
+      <w:r>
+        <w:rPr>
+          <w:rFonts w:ascii="Times New Roman" w:hAnsi="Times New Roman" w:cs="Times New Roman"/>
+        </w:rPr>
+        <w:t xml:space="preserve">The </w:t>
+      </w:r>
+      <w:r>
+        <w:rPr>
+          <w:rFonts w:ascii="Times New Roman" w:hAnsi="Times New Roman" w:cs="Times New Roman"/>
+          <w:b/>
+          <w:bCs/>
+        </w:rPr>
+        <w:t>Kinect Activity Recognition Dataset (KARD)</w:t>
+      </w:r>
+      <w:r>
+        <w:rPr>
+          <w:rFonts w:ascii="Times New Roman" w:hAnsi="Times New Roman" w:cs="Times New Roman"/>
+        </w:rPr>
+        <w:t xml:space="preserve"> is a widely used benchmark for Human Activity Recognition, providing multi-modal recordings of human motion captured with the Microsoft Kinect sensor. The dataset includes 18 distinct activities performed three times by ten different subjects, offering variability in execution style and providing a comprehensive resource for evaluating HAR algorithms.</w:t>
+      </w:r>
+    </w:p>
+    <w:p>
+      <w:pPr>
+        <w:jc w:val="both"/>
+        <w:rPr>
+          <w:rFonts w:ascii="Times New Roman" w:hAnsi="Times New Roman" w:cs="Times New Roman"/>
+          <w:b/>
+          <w:bCs/>
+        </w:rPr>
+      </w:pPr>
+      <w:r>
+        <w:rPr>
+          <w:rFonts w:ascii="Times New Roman" w:hAnsi="Times New Roman" w:cs="Times New Roman"/>
+          <w:b/>
+          <w:bCs/>
+        </w:rPr>
+        <w:t>A.</w:t>
+      </w:r>
+      <w:r>
+        <w:rPr>
+          <w:rFonts w:ascii="Times New Roman" w:hAnsi="Times New Roman" w:cs="Times New Roman"/>
+          <w:b/>
+          <w:bCs/>
+        </w:rPr>
+        <w:t xml:space="preserve"> </w:t>
+      </w:r>
+      <w:r>
+        <w:rPr>
+          <w:rFonts w:ascii="Times New Roman" w:hAnsi="Times New Roman" w:cs="Times New Roman"/>
+          <w:b/>
+          <w:bCs/>
+        </w:rPr>
+        <w:t xml:space="preserve"> Activity Classes</w:t>
+      </w:r>
+    </w:p>
+    <w:p>
+      <w:pPr>
+        <w:jc w:val="both"/>
+        <w:rPr>
+          <w:rFonts w:ascii="Times New Roman" w:hAnsi="Times New Roman" w:cs="Times New Roman"/>
+        </w:rPr>
+      </w:pPr>
+      <w:r>
+        <w:rPr>
+          <w:rFonts w:ascii="Times New Roman" w:hAnsi="Times New Roman" w:cs="Times New Roman"/>
+        </w:rPr>
+        <w:t>KARD contains 18 actions representing a diverse set of dynamic and daily-life activities: horizontal arm wave, high arm wave, two-hand wave, catch cap, high throw, draw X, draw tick, toss paper, forward kick, side kick, take umbrella, bend, hand clap, walk, phone call, drink, sit down, stand up. Each activity is repeated three times by ten subjects, resulting in a total of 2160 files.</w:t>
+      </w:r>
+    </w:p>
+    <w:p>
+      <w:pPr>
+        <w:jc w:val="both"/>
+        <w:rPr>
+          <w:rFonts w:ascii="Times New Roman" w:hAnsi="Times New Roman" w:cs="Times New Roman"/>
+          <w:b/>
+          <w:bCs/>
+        </w:rPr>
+      </w:pPr>
+      <w:r>
+        <w:rPr>
+          <w:rFonts w:ascii="Times New Roman" w:hAnsi="Times New Roman" w:cs="Times New Roman"/>
+          <w:b/>
+          <w:bCs/>
+        </w:rPr>
+        <w:t>B.</w:t>
+      </w:r>
+      <w:r>
+        <w:rPr>
+          <w:rFonts w:ascii="Times New Roman" w:hAnsi="Times New Roman" w:cs="Times New Roman"/>
+          <w:b/>
+          <w:bCs/>
+        </w:rPr>
+        <w:t xml:space="preserve"> </w:t>
+      </w:r>
+      <w:r>
+        <w:rPr>
+          <w:rFonts w:ascii="Times New Roman" w:hAnsi="Times New Roman" w:cs="Times New Roman"/>
+          <w:b/>
+          <w:bCs/>
+        </w:rPr>
+        <w:t xml:space="preserve"> Data Organization</w:t>
+      </w:r>
+    </w:p>
+    <w:p>
+      <w:pPr>
+        <w:jc w:val="both"/>
+        <w:rPr>
+          <w:rFonts w:ascii="Times New Roman" w:hAnsi="Times New Roman" w:cs="Times New Roman"/>
+        </w:rPr>
+      </w:pPr>
+      <w:r>
+        <w:rPr>
+          <w:rFonts w:ascii="Times New Roman" w:hAnsi="Times New Roman" w:cs="Times New Roman"/>
+        </w:rPr>
+        <w:t xml:space="preserve">The dataset follows a standardized naming convention to uniquely identify each recording, in the form </w:t>
       </w:r>
       <w:proofErr w:type="spellStart"/>
       <w:r>
         <w:rPr>
           <w:rFonts w:ascii="Times New Roman" w:hAnsi="Times New Roman" w:cs="Times New Roman"/>
         </w:rPr>
-        <w:t>modeling</w:t>
+        <w:t>aA_sS_eN_string</w:t>
       </w:r>
       <w:proofErr w:type="spellEnd"/>
       <w:r>
         <w:rPr>
           <w:rFonts w:ascii="Times New Roman" w:hAnsi="Times New Roman" w:cs="Times New Roman"/>
         </w:rPr>
-        <w:t xml:space="preserve"> of human motion.</w:t>
-      </w:r>
-    </w:p>
-    <w:p>
-      <w:pPr>
-        <w:jc w:val="both"/>
-        <w:rPr>
-          <w:rFonts w:ascii="Times New Roman" w:hAnsi="Times New Roman" w:cs="Times New Roman"/>
-        </w:rPr>
-      </w:pPr>
-    </w:p>
-    <w:p>
-      <w:pPr>
-        <w:jc w:val="both"/>
-        <w:rPr>
-          <w:rFonts w:ascii="Times New Roman" w:hAnsi="Times New Roman" w:cs="Times New Roman"/>
-          <w:b/>
-          <w:bCs/>
-        </w:rPr>
-      </w:pPr>
-      <w:r>
-        <w:rPr>
-          <w:rFonts w:ascii="Times New Roman" w:hAnsi="Times New Roman" w:cs="Times New Roman"/>
-          <w:b/>
-          <w:bCs/>
-        </w:rPr>
-        <w:t>3.</w:t>
-      </w:r>
-      <w:r>
-        <w:rPr>
-          <w:rFonts w:ascii="Times New Roman" w:hAnsi="Times New Roman" w:cs="Times New Roman"/>
-          <w:b/>
-          <w:bCs/>
-        </w:rPr>
-        <w:t>1.2</w:t>
-      </w:r>
-      <w:r>
-        <w:rPr>
-          <w:rFonts w:ascii="Times New Roman" w:hAnsi="Times New Roman" w:cs="Times New Roman"/>
-          <w:b/>
-          <w:bCs/>
-        </w:rPr>
-        <w:t xml:space="preserve"> KARD Dataset Description</w:t>
-      </w:r>
-    </w:p>
-    <w:p>
-      <w:pPr>
-        <w:jc w:val="both"/>
-        <w:rPr>
-          <w:rFonts w:ascii="Times New Roman" w:hAnsi="Times New Roman" w:cs="Times New Roman"/>
-        </w:rPr>
-      </w:pPr>
-      <w:r>
-        <w:rPr>
-          <w:rFonts w:ascii="Times New Roman" w:hAnsi="Times New Roman" w:cs="Times New Roman"/>
-        </w:rPr>
-        <w:t xml:space="preserve">The </w:t>
-      </w:r>
-      <w:r>
-        <w:rPr>
-          <w:rFonts w:ascii="Times New Roman" w:hAnsi="Times New Roman" w:cs="Times New Roman"/>
-          <w:b/>
-          <w:bCs/>
-        </w:rPr>
-        <w:t>Kinect Activity Recognition Dataset (KARD)</w:t>
-      </w:r>
-      <w:r>
-        <w:rPr>
-          <w:rFonts w:ascii="Times New Roman" w:hAnsi="Times New Roman" w:cs="Times New Roman"/>
-        </w:rPr>
-        <w:t xml:space="preserve"> is a widely used benchmark for Human Activity Recognition, providing multi-modal recordings of human motion captured with the Microsoft Kinect sensor. The dataset includes 18 distinct activities performed three times by ten different subjects, offering variability in execution style and providing a comprehensive resource for evaluating HAR algorithms.</w:t>
-      </w:r>
-    </w:p>
-    <w:p>
-      <w:pPr>
-        <w:jc w:val="both"/>
-        <w:rPr>
-          <w:rFonts w:ascii="Times New Roman" w:hAnsi="Times New Roman" w:cs="Times New Roman"/>
-          <w:b/>
-          <w:bCs/>
-        </w:rPr>
-      </w:pPr>
-      <w:r>
-        <w:rPr>
-          <w:rFonts w:ascii="Times New Roman" w:hAnsi="Times New Roman" w:cs="Times New Roman"/>
-          <w:b/>
-          <w:bCs/>
-        </w:rPr>
-        <w:t>A.</w:t>
-      </w:r>
-      <w:r>
-        <w:rPr>
-          <w:rFonts w:ascii="Times New Roman" w:hAnsi="Times New Roman" w:cs="Times New Roman"/>
-          <w:b/>
-          <w:bCs/>
+        <w:t>, where A is the two-digit action ID, S is the two-digit subject ID, N is the repetition number, and string indicates the data modality. The dataset provides four types of files for each sequence: depthmaps.txt for depth map sequences, .mp4 for RGB video at 640×480 resolution, realworld.txt for skeletal joint positions in real-world coordinates, and screen.txt for skeletal joint positions in screen coordinates with depth information. For example, a04_s03_e02_realworld.txt contains the real-world joint coordinates for the second repetition of action #4 performed by subject #3.</w:t>
+      </w:r>
+    </w:p>
+    <w:p>
+      <w:pPr>
+        <w:jc w:val="both"/>
+        <w:rPr>
+          <w:rFonts w:ascii="Times New Roman" w:hAnsi="Times New Roman" w:cs="Times New Roman"/>
+        </w:rPr>
+      </w:pPr>
+      <w:r>
+        <w:rPr>
+          <w:rFonts w:ascii="Times New Roman" w:hAnsi="Times New Roman" w:cs="Times New Roman"/>
+        </w:rPr>
+        <w:t>C.</w:t>
+      </w:r>
+      <w:r>
+        <w:rPr>
+          <w:rFonts w:ascii="Times New Roman" w:hAnsi="Times New Roman" w:cs="Times New Roman"/>
         </w:rPr>
         <w:t xml:space="preserve"> </w:t>
       </w:r>
@@ -2865,39 +3606,39 @@
           <w:b/>
           <w:bCs/>
         </w:rPr>
-        <w:t xml:space="preserve"> Activity Classes</w:t>
-      </w:r>
-    </w:p>
-    <w:p>
-      <w:pPr>
-        <w:jc w:val="both"/>
-        <w:rPr>
-          <w:rFonts w:ascii="Times New Roman" w:hAnsi="Times New Roman" w:cs="Times New Roman"/>
-        </w:rPr>
-      </w:pPr>
-      <w:r>
-        <w:rPr>
-          <w:rFonts w:ascii="Times New Roman" w:hAnsi="Times New Roman" w:cs="Times New Roman"/>
-        </w:rPr>
-        <w:t>KARD contains 18 actions representing a diverse set of dynamic and daily-life activities: horizontal arm wave, high arm wave, two-hand wave, catch cap, high throw, draw X, draw tick, toss paper, forward kick, side kick, take umbrella, bend, hand clap, walk, phone call, drink, sit down, stand up. Each activity is repeated three times by ten subjects, resulting in a total of 2160 files.</w:t>
-      </w:r>
-    </w:p>
-    <w:p>
-      <w:pPr>
-        <w:jc w:val="both"/>
-        <w:rPr>
-          <w:rFonts w:ascii="Times New Roman" w:hAnsi="Times New Roman" w:cs="Times New Roman"/>
-          <w:b/>
-          <w:bCs/>
-        </w:rPr>
-      </w:pPr>
-      <w:r>
-        <w:rPr>
-          <w:rFonts w:ascii="Times New Roman" w:hAnsi="Times New Roman" w:cs="Times New Roman"/>
-          <w:b/>
-          <w:bCs/>
-        </w:rPr>
-        <w:t>B.</w:t>
+        <w:t>Skeletal Data Representation</w:t>
+      </w:r>
+    </w:p>
+    <w:p>
+      <w:pPr>
+        <w:jc w:val="both"/>
+        <w:rPr>
+          <w:rFonts w:ascii="Times New Roman" w:hAnsi="Times New Roman" w:cs="Times New Roman"/>
+        </w:rPr>
+      </w:pPr>
+      <w:r>
+        <w:rPr>
+          <w:rFonts w:ascii="Times New Roman" w:hAnsi="Times New Roman" w:cs="Times New Roman"/>
+        </w:rPr>
+        <w:t>The dataset records 15 key skeletal joints in each frame, listed consecutively as: head, neck, right shoulder, right elbow, right hand, left shoulder, left elbow, left hand, torso, right hip, right knee, right foot, left hip, left knee, left foot. Each file contains 15 × F lines, where F is the number of frames in the sequence, and each line reports three numbers: (x, y, z) for real-world coordinates in realworld.txt or (u, v, depth) for screen coordinates in screen.txt. This structure captures both fine-grained and larger body movements for precise motion analysis.</w:t>
+      </w:r>
+    </w:p>
+    <w:p>
+      <w:pPr>
+        <w:jc w:val="both"/>
+        <w:rPr>
+          <w:rFonts w:ascii="Times New Roman" w:hAnsi="Times New Roman" w:cs="Times New Roman"/>
+          <w:b/>
+          <w:bCs/>
+        </w:rPr>
+      </w:pPr>
+      <w:r>
+        <w:rPr>
+          <w:rFonts w:ascii="Times New Roman" w:hAnsi="Times New Roman" w:cs="Times New Roman"/>
+          <w:b/>
+          <w:bCs/>
+        </w:rPr>
+        <w:t>D.</w:t>
       </w:r>
       <w:r>
         <w:rPr>
@@ -2913,110 +3654,6 @@
           <w:b/>
           <w:bCs/>
         </w:rPr>
-        <w:t xml:space="preserve"> Data Organization</w:t>
-      </w:r>
-    </w:p>
-    <w:p>
-      <w:pPr>
-        <w:jc w:val="both"/>
-        <w:rPr>
-          <w:rFonts w:ascii="Times New Roman" w:hAnsi="Times New Roman" w:cs="Times New Roman"/>
-        </w:rPr>
-      </w:pPr>
-      <w:r>
-        <w:rPr>
-          <w:rFonts w:ascii="Times New Roman" w:hAnsi="Times New Roman" w:cs="Times New Roman"/>
-        </w:rPr>
-        <w:t xml:space="preserve">The dataset follows a standardized naming convention to uniquely identify each recording, in the form </w:t>
-      </w:r>
-      <w:proofErr w:type="spellStart"/>
-      <w:r>
-        <w:rPr>
-          <w:rFonts w:ascii="Times New Roman" w:hAnsi="Times New Roman" w:cs="Times New Roman"/>
-        </w:rPr>
-        <w:t>aA_sS_eN_string</w:t>
-      </w:r>
-      <w:proofErr w:type="spellEnd"/>
-      <w:r>
-        <w:rPr>
-          <w:rFonts w:ascii="Times New Roman" w:hAnsi="Times New Roman" w:cs="Times New Roman"/>
-        </w:rPr>
-        <w:t>, where A is the two-digit action ID, S is the two-digit subject ID, N is the repetition number, and string indicates the data modality. The dataset provides four types of files for each sequence: depthmaps.txt for depth map sequences, .mp4 for RGB video at 640×480 resolution, realworld.txt for skeletal joint positions in real-world coordinates, and screen.txt for skeletal joint positions in screen coordinates with depth information. For example, a04_s03_e02_realworld.txt contains the real-world joint coordinates for the second repetition of action #4 performed by subject #3.</w:t>
-      </w:r>
-    </w:p>
-    <w:p>
-      <w:pPr>
-        <w:jc w:val="both"/>
-        <w:rPr>
-          <w:rFonts w:ascii="Times New Roman" w:hAnsi="Times New Roman" w:cs="Times New Roman"/>
-        </w:rPr>
-      </w:pPr>
-      <w:r>
-        <w:rPr>
-          <w:rFonts w:ascii="Times New Roman" w:hAnsi="Times New Roman" w:cs="Times New Roman"/>
-        </w:rPr>
-        <w:t>C.</w:t>
-      </w:r>
-      <w:r>
-        <w:rPr>
-          <w:rFonts w:ascii="Times New Roman" w:hAnsi="Times New Roman" w:cs="Times New Roman"/>
-        </w:rPr>
-        <w:t xml:space="preserve"> </w:t>
-      </w:r>
-      <w:r>
-        <w:rPr>
-          <w:rFonts w:ascii="Times New Roman" w:hAnsi="Times New Roman" w:cs="Times New Roman"/>
-          <w:b/>
-          <w:bCs/>
-        </w:rPr>
-        <w:t>Skeletal Data Representation</w:t>
-      </w:r>
-    </w:p>
-    <w:p>
-      <w:pPr>
-        <w:jc w:val="both"/>
-        <w:rPr>
-          <w:rFonts w:ascii="Times New Roman" w:hAnsi="Times New Roman" w:cs="Times New Roman"/>
-        </w:rPr>
-      </w:pPr>
-      <w:r>
-        <w:rPr>
-          <w:rFonts w:ascii="Times New Roman" w:hAnsi="Times New Roman" w:cs="Times New Roman"/>
-        </w:rPr>
-        <w:t>The dataset records 15 key skeletal joints in each frame, listed consecutively as: head, neck, right shoulder, right elbow, right hand, left shoulder, left elbow, left hand, torso, right hip, right knee, right foot, left hip, left knee, left foot. Each file contains 15 × F lines, where F is the number of frames in the sequence, and each line reports three numbers: (x, y, z) for real-world coordinates in realworld.txt or (u, v, depth) for screen coordinates in screen.txt. This structure captures both fine-grained and larger body movements for precise motion analysis.</w:t>
-      </w:r>
-    </w:p>
-    <w:p>
-      <w:pPr>
-        <w:jc w:val="both"/>
-        <w:rPr>
-          <w:rFonts w:ascii="Times New Roman" w:hAnsi="Times New Roman" w:cs="Times New Roman"/>
-          <w:b/>
-          <w:bCs/>
-        </w:rPr>
-      </w:pPr>
-      <w:r>
-        <w:rPr>
-          <w:rFonts w:ascii="Times New Roman" w:hAnsi="Times New Roman" w:cs="Times New Roman"/>
-          <w:b/>
-          <w:bCs/>
-        </w:rPr>
-        <w:t>D.</w:t>
-      </w:r>
-      <w:r>
-        <w:rPr>
-          <w:rFonts w:ascii="Times New Roman" w:hAnsi="Times New Roman" w:cs="Times New Roman"/>
-          <w:b/>
-          <w:bCs/>
-        </w:rPr>
-        <w:t xml:space="preserve"> </w:t>
-      </w:r>
-      <w:r>
-        <w:rPr>
-          <w:rFonts w:ascii="Times New Roman" w:hAnsi="Times New Roman" w:cs="Times New Roman"/>
-          <w:b/>
-          <w:bCs/>
-        </w:rPr>
         <w:t xml:space="preserve"> Temporal and Spatial Properties</w:t>
       </w:r>
     </w:p>
@@ -3031,7 +3668,6 @@
         <w:rPr>
           <w:rFonts w:ascii="Times New Roman" w:hAnsi="Times New Roman" w:cs="Times New Roman"/>
         </w:rPr>
-        <w:lastRenderedPageBreak/>
         <w:t xml:space="preserve">KARD consists of 540 sequences, </w:t>
       </w:r>
       <w:proofErr w:type="spellStart"/>
@@ -3272,6 +3908,7 @@
               <w:rPr>
                 <w:rFonts w:ascii="Times New Roman" w:hAnsi="Times New Roman" w:cs="Times New Roman"/>
               </w:rPr>
+              <w:lastRenderedPageBreak/>
               <w:t>Standing / Stand up</w:t>
             </w:r>
           </w:p>
@@ -5288,7 +5925,6 @@
               <w:rPr>
                 <w:rFonts w:ascii="Times New Roman" w:hAnsi="Times New Roman" w:cs="Times New Roman"/>
               </w:rPr>
-              <w:lastRenderedPageBreak/>
               <w:t>Toss Paper</w:t>
             </w:r>
           </w:p>
@@ -5655,6 +6291,7 @@
           <w:rFonts w:ascii="Times New Roman" w:hAnsi="Times New Roman" w:cs="Times New Roman"/>
           <w:lang w:val="en-US"/>
         </w:rPr>
+        <w:lastRenderedPageBreak/>
         <w:br/>
       </w:r>
       <w:r>
@@ -6816,14 +7453,7 @@
         <w:rPr>
           <w:rFonts w:ascii="Times New Roman" w:hAnsi="Times New Roman" w:cs="Times New Roman"/>
         </w:rPr>
-        <w:t>. The remaining numerical columns—</w:t>
-      </w:r>
-      <w:r>
-        <w:rPr>
-          <w:rFonts w:ascii="Times New Roman" w:hAnsi="Times New Roman" w:cs="Times New Roman"/>
-        </w:rPr>
-        <w:lastRenderedPageBreak/>
-        <w:t xml:space="preserve">representing the 3D joint coordinates—form the core feature set, resulting in an </w:t>
+        <w:t xml:space="preserve">. The remaining numerical columns—representing the 3D joint coordinates—form the core feature set, resulting in an </w:t>
       </w:r>
       <m:oMath>
         <m:r>
@@ -6915,6 +7545,7 @@
         <w:rPr>
           <w:rFonts w:ascii="Times New Roman" w:hAnsi="Times New Roman" w:cs="Times New Roman"/>
         </w:rPr>
+        <w:lastRenderedPageBreak/>
         <w:t>After cleaning, each recording is transformed into a well-structured numerical matrix of shape</w:t>
       </w:r>
     </w:p>
@@ -7918,6 +8549,7 @@
           <w:b/>
           <w:bCs/>
         </w:rPr>
+        <w:lastRenderedPageBreak/>
         <w:t>D. Output Representation</w:t>
       </w:r>
     </w:p>
@@ -8625,6 +9257,7 @@
           <w:b/>
           <w:bCs/>
         </w:rPr>
+        <w:lastRenderedPageBreak/>
         <w:t>Mean:</w:t>
       </w:r>
     </w:p>
@@ -9491,7 +10124,6 @@
         <w:rPr>
           <w:rFonts w:ascii="Times New Roman" w:hAnsi="Times New Roman" w:cs="Times New Roman"/>
         </w:rPr>
-        <w:lastRenderedPageBreak/>
         <w:t xml:space="preserve">To guarantee identical preprocessing during inference, the </w:t>
       </w:r>
       <w:proofErr w:type="spellStart"/>
@@ -9606,7 +10238,14 @@
         <w:rPr>
           <w:rFonts w:ascii="Times New Roman" w:hAnsi="Times New Roman" w:cs="Times New Roman"/>
         </w:rPr>
-        <w:t xml:space="preserve"> architecture and allows the model to optimize using categorical loss functions. The transformation is carried out in two stages—label encoding and one-hot encoding—to preserve class separability while maintaining computational efficiency.</w:t>
+        <w:t xml:space="preserve"> architecture and allows the model to optimize using categorical loss </w:t>
+      </w:r>
+      <w:r>
+        <w:rPr>
+          <w:rFonts w:ascii="Times New Roman" w:hAnsi="Times New Roman" w:cs="Times New Roman"/>
+        </w:rPr>
+        <w:lastRenderedPageBreak/>
+        <w:t>functions. The transformation is carried out in two stages—label encoding and one-hot encoding—to preserve class separability while maintaining computational efficiency.</w:t>
       </w:r>
     </w:p>
     <w:p>
@@ -10221,7 +10860,6 @@
             <w:rPr>
               <w:rFonts w:ascii="Cambria Math" w:hAnsi="Cambria Math" w:cs="Times New Roman"/>
             </w:rPr>
-            <w:lastRenderedPageBreak/>
             <m:t>y∈</m:t>
           </m:r>
           <m:sSup>
@@ -10356,6 +10994,7 @@
         <w:rPr>
           <w:rFonts w:ascii="Times New Roman" w:hAnsi="Times New Roman" w:cs="Times New Roman"/>
         </w:rPr>
+        <w:lastRenderedPageBreak/>
         <w:t>Following preprocessing—standardization, windowing, and label encoding—the dataset is divided into training and testing subsets to ensure an unbiased evaluation of the MS-GRS-</w:t>
       </w:r>
       <w:proofErr w:type="spellStart"/>
@@ -11289,55 +11928,55 @@
       </w:r>
       <w:proofErr w:type="spellEnd"/>
       <w:r>
-        <w:t xml:space="preserve"> architecture is developed to effectively model the multi-scale temporal patterns and long-range dependencies inherent in Kinect-based skeletal motion data. By combining multi-scale temporal feature extraction with gated residual skip pathways and bidirectional recurrent processing, the model is able to preserve fine-grained joint dynamics </w:t>
+        <w:t xml:space="preserve"> architecture is developed to effectively model the multi-scale temporal patterns and long-range dependencies inherent in Kinect-based skeletal motion data. By combining multi-scale temporal feature extraction with gated residual skip pathways and bidirectional recurrent processing, the model is able to preserve fine-grained joint dynamics while simultaneously capturing broader temporal structure. This integrated design enables the network to learn a stable and highly discriminative representation of human activities, supporting reliable recognition across diverse motion sequences.</w:t>
+      </w:r>
+    </w:p>
+    <w:p>
+      <w:pPr>
+        <w:jc w:val="both"/>
+      </w:pPr>
+    </w:p>
+    <w:p>
+      <w:pPr>
+        <w:jc w:val="both"/>
+        <w:rPr>
+          <w:b/>
+          <w:bCs/>
+        </w:rPr>
+      </w:pPr>
+      <w:r>
+        <w:rPr>
+          <w:b/>
+          <w:bCs/>
+        </w:rPr>
+        <w:t>3.3.1 Multi-Scale Temporal Learning</w:t>
+      </w:r>
+    </w:p>
+    <w:p>
+      <w:pPr>
+        <w:jc w:val="both"/>
+      </w:pPr>
+      <w:r>
+        <w:t>The Multi-Scale Temporal Learning module in the MS-GRS-</w:t>
+      </w:r>
+      <w:proofErr w:type="spellStart"/>
+      <w:r>
+        <w:t>BiLSTM</w:t>
+      </w:r>
+      <w:proofErr w:type="spellEnd"/>
+      <w:r>
+        <w:t xml:space="preserve"> model is designed to capture the wide range of temporal dynamics present in human activities recorded with the Kinect sensor. Human movements occur at different speeds and durations—from rapid hand </w:t>
       </w:r>
       <w:r>
         <w:lastRenderedPageBreak/>
-        <w:t>while simultaneously capturing broader temporal structure. This integrated design enables the network to learn a stable and highly discriminative representation of human activities, supporting reliable recognition across diverse motion sequences.</w:t>
-      </w:r>
-    </w:p>
-    <w:p>
-      <w:pPr>
-        <w:jc w:val="both"/>
-      </w:pPr>
-    </w:p>
-    <w:p>
-      <w:pPr>
-        <w:jc w:val="both"/>
-        <w:rPr>
-          <w:b/>
-          <w:bCs/>
-        </w:rPr>
-      </w:pPr>
-      <w:r>
-        <w:rPr>
-          <w:b/>
-          <w:bCs/>
-        </w:rPr>
-        <w:t>3.3.1 Multi-Scale Temporal Learning</w:t>
-      </w:r>
-    </w:p>
-    <w:p>
-      <w:pPr>
-        <w:jc w:val="both"/>
-      </w:pPr>
-      <w:r>
-        <w:t>The Multi-Scale Temporal Learning module in the MS-GRS-</w:t>
+        <w:t xml:space="preserve">or finger gestures to longer cycles like walking or sit-to-stand transitions. </w:t>
       </w:r>
       <w:proofErr w:type="spellStart"/>
       <w:r>
-        <w:t>BiLSTM</w:t>
+        <w:t>Modeling</w:t>
       </w:r>
       <w:proofErr w:type="spellEnd"/>
       <w:r>
-        <w:t xml:space="preserve"> model is designed to capture the wide range of temporal dynamics present in human activities recorded with the Kinect sensor. Human movements occur at different speeds and durations—from rapid hand or finger gestures to longer cycles like walking or sit-to-stand transitions. </w:t>
-      </w:r>
-      <w:proofErr w:type="spellStart"/>
-      <w:r>
-        <w:t>Modeling</w:t>
-      </w:r>
-      <w:proofErr w:type="spellEnd"/>
-      <w:r>
         <w:t xml:space="preserve"> these patterns with a single temporal resolution is insufficient, so we process the input sequences at multiple scales in parallel to effectively capture short-term, medium-term, and long-term motions.</w:t>
       </w:r>
     </w:p>
@@ -11350,7 +11989,7 @@
           <w:noProof/>
         </w:rPr>
         <w:drawing>
-          <wp:inline distT="0" distB="0" distL="0" distR="0" wp14:anchorId="61FC4C97" wp14:editId="445F58D7">
+          <wp:inline distT="0" distB="0" distL="0" distR="0" wp14:anchorId="61FC4C97" wp14:editId="104C79F9">
             <wp:extent cx="5730240" cy="3124200"/>
             <wp:effectExtent l="0" t="0" r="3810" b="0"/>
             <wp:docPr id="2109078136" name="Picture 3"/>
@@ -11489,7 +12128,6 @@
           <w:b/>
           <w:bCs/>
         </w:rPr>
-        <w:lastRenderedPageBreak/>
         <w:t>B. Input Representation</w:t>
       </w:r>
     </w:p>
@@ -12326,6 +12964,7 @@
         <w:jc w:val="both"/>
       </w:pPr>
       <w:r>
+        <w:lastRenderedPageBreak/>
         <w:t xml:space="preserve">Here, </w:t>
       </w:r>
       <m:oMath>
@@ -13748,7 +14387,6 @@
           <w:b/>
           <w:bCs/>
         </w:rPr>
-        <w:lastRenderedPageBreak/>
         <w:t>C. Bidirectional Contextual Learning</w:t>
       </w:r>
     </w:p>
@@ -14003,13 +14641,7 @@
             <w:rPr>
               <w:rFonts w:ascii="Cambria Math" w:hAnsi="Cambria Math"/>
             </w:rPr>
-            <m:t xml:space="preserve">)   </m:t>
-          </m:r>
-          <m:r>
-            <w:rPr>
-              <w:rFonts w:ascii="Cambria Math" w:hAnsi="Cambria Math"/>
-            </w:rPr>
-            <m:t xml:space="preserve">    </m:t>
+            <m:t xml:space="preserve">)       </m:t>
           </m:r>
           <m:r>
             <m:rPr>
@@ -14050,13 +14682,7 @@
                 <w:rPr>
                   <w:rFonts w:ascii="Cambria Math" w:hAnsi="Cambria Math"/>
                 </w:rPr>
-                <m:t xml:space="preserve">      </m:t>
-              </m:r>
-              <m:r>
-                <w:rPr>
-                  <w:rFonts w:ascii="Cambria Math" w:hAnsi="Cambria Math"/>
-                </w:rPr>
-                <m:t>h</m:t>
+                <m:t xml:space="preserve">      h</m:t>
               </m:r>
             </m:e>
             <m:sub>
@@ -14323,15 +14949,7 @@
           <w:b/>
           <w:bCs/>
         </w:rPr>
-        <w:t>Bi</w:t>
-      </w:r>
-      <w:r>
-        <w:rPr>
-          <w:rFonts w:ascii="Times New Roman" w:hAnsi="Times New Roman" w:cs="Times New Roman"/>
-          <w:b/>
-          <w:bCs/>
-        </w:rPr>
-        <w:t>LSTM</w:t>
+        <w:t>BiLSTM</w:t>
       </w:r>
       <w:proofErr w:type="spellEnd"/>
       <w:r>
@@ -14826,7 +15444,6 @@
         <w:jc w:val="both"/>
       </w:pPr>
       <w:r>
-        <w:lastRenderedPageBreak/>
         <w:t xml:space="preserve">The gate </w:t>
       </w:r>
       <m:oMath>
@@ -15077,7 +15694,11 @@
         <w:jc w:val="both"/>
       </w:pPr>
       <w:r>
-        <w:t>This skip connection preserves features across layers, stabilizes gradient flow, mitigates vanishing gradients, and accelerates convergence. It ensures that early-stage and higher-level temporal features are effectively utilized throughout the network, improving the robustness and accuracy of activity recognition.</w:t>
+        <w:t xml:space="preserve">This skip connection preserves features across layers, stabilizes gradient flow, mitigates vanishing gradients, and accelerates convergence. It ensures that early-stage and higher-level </w:t>
+      </w:r>
+      <w:r>
+        <w:lastRenderedPageBreak/>
+        <w:t>temporal features are effectively utilized throughout the network, improving the robustness and accuracy of activity recognition.</w:t>
       </w:r>
     </w:p>
     <w:p>
@@ -15635,7 +16256,6 @@
         <w:jc w:val="both"/>
       </w:pPr>
       <w:r>
-        <w:lastRenderedPageBreak/>
         <w:t>After pooling, the feature vectors from all three scales—</w:t>
       </w:r>
       <m:oMath>
@@ -16991,7 +17611,7 @@
           <w:noProof/>
         </w:rPr>
         <w:drawing>
-          <wp:anchor distT="0" distB="0" distL="114300" distR="114300" simplePos="0" relativeHeight="251658240" behindDoc="0" locked="0" layoutInCell="1" allowOverlap="1" wp14:anchorId="3DD8B7AD" wp14:editId="3464E1EB">
+          <wp:anchor distT="0" distB="0" distL="114300" distR="114300" simplePos="0" relativeHeight="251658240" behindDoc="0" locked="0" layoutInCell="1" allowOverlap="1" wp14:anchorId="3DD8B7AD" wp14:editId="2848EA2D">
             <wp:simplePos x="0" y="0"/>
             <wp:positionH relativeFrom="margin">
               <wp:posOffset>784225</wp:posOffset>
@@ -17253,96 +17873,102 @@
         <w:rPr>
           <w:rFonts w:ascii="Times New Roman" w:hAnsi="Times New Roman" w:cs="Times New Roman"/>
         </w:rPr>
+        <w:t xml:space="preserve">A </w:t>
+      </w:r>
+      <w:r>
+        <w:rPr>
+          <w:rFonts w:ascii="Times New Roman" w:hAnsi="Times New Roman" w:cs="Times New Roman"/>
+          <w:b/>
+          <w:bCs/>
+        </w:rPr>
+        <w:t>custom skeletal dataset</w:t>
+      </w:r>
+      <w:r>
+        <w:rPr>
+          <w:rFonts w:ascii="Times New Roman" w:hAnsi="Times New Roman" w:cs="Times New Roman"/>
+        </w:rPr>
+        <w:t xml:space="preserve"> was collected specifically for this study. The dataset consists of recordings from </w:t>
+      </w:r>
+      <w:r>
+        <w:rPr>
+          <w:rFonts w:ascii="Times New Roman" w:hAnsi="Times New Roman" w:cs="Times New Roman"/>
+          <w:b/>
+          <w:bCs/>
+        </w:rPr>
+        <w:t>30 volunteers</w:t>
+      </w:r>
+      <w:r>
+        <w:rPr>
+          <w:rFonts w:ascii="Times New Roman" w:hAnsi="Times New Roman" w:cs="Times New Roman"/>
+        </w:rPr>
+        <w:t xml:space="preserve"> of varying ages, body shapes, heights, and genders to capture inter-subject motion variability. Each participant performed </w:t>
+      </w:r>
+      <w:r>
+        <w:rPr>
+          <w:rFonts w:ascii="Times New Roman" w:hAnsi="Times New Roman" w:cs="Times New Roman"/>
+          <w:b/>
+          <w:bCs/>
+        </w:rPr>
+        <w:t>seven daily activities</w:t>
+      </w:r>
+      <w:r>
+        <w:rPr>
+          <w:rFonts w:ascii="Times New Roman" w:hAnsi="Times New Roman" w:cs="Times New Roman"/>
+        </w:rPr>
+        <w:t>: bending, jumping, running, sitting, squatting, standing, and walking. Data collection was conducted in a controlled indoor environment to reduce external disturbances while preserving natural movement execution. The dataset is organized hierarchically by subject, with individual folders containing separate CSV files for each activity. Each CSV file stores time-series skeletal data, where each frame contains the 3D coordinates of all tracked joints along with auxiliary</w:t>
+      </w:r>
+      <w:r>
+        <w:rPr>
+          <w:rFonts w:ascii="Times New Roman" w:hAnsi="Times New Roman" w:cs="Times New Roman"/>
+        </w:rPr>
+        <w:t xml:space="preserve"> </w:t>
+      </w:r>
+      <w:r>
+        <w:rPr>
+          <w:rFonts w:ascii="Times New Roman" w:hAnsi="Times New Roman" w:cs="Times New Roman"/>
+        </w:rPr>
+        <w:t>metadata.</w:t>
+      </w:r>
+      <w:r>
+        <w:rPr>
+          <w:rFonts w:ascii="Times New Roman" w:hAnsi="Times New Roman" w:cs="Times New Roman"/>
+        </w:rPr>
+        <w:t xml:space="preserve"> </w:t>
+      </w:r>
+    </w:p>
+    <w:p>
+      <w:pPr>
+        <w:jc w:val="both"/>
+        <w:rPr>
+          <w:rFonts w:ascii="Times New Roman" w:hAnsi="Times New Roman" w:cs="Times New Roman"/>
+        </w:rPr>
+      </w:pPr>
+      <w:r>
+        <w:rPr>
+          <w:rFonts w:ascii="Times New Roman" w:hAnsi="Times New Roman" w:cs="Times New Roman"/>
+        </w:rPr>
+        <w:t xml:space="preserve">To assess the general applicability of the experimental setup across datasets, the </w:t>
+      </w:r>
+      <w:r>
+        <w:rPr>
+          <w:rFonts w:ascii="Times New Roman" w:hAnsi="Times New Roman" w:cs="Times New Roman"/>
+          <w:b/>
+          <w:bCs/>
+        </w:rPr>
+        <w:t>Kinect Activity Recognition Dataset (KARD)</w:t>
+      </w:r>
+      <w:r>
+        <w:rPr>
+          <w:rFonts w:ascii="Times New Roman" w:hAnsi="Times New Roman" w:cs="Times New Roman"/>
+        </w:rPr>
+        <w:t xml:space="preserve"> was employed as an external benchmark. KARD </w:t>
+      </w:r>
+      <w:r>
+        <w:rPr>
+          <w:rFonts w:ascii="Times New Roman" w:hAnsi="Times New Roman" w:cs="Times New Roman"/>
+        </w:rPr>
         <w:lastRenderedPageBreak/>
-        <w:t xml:space="preserve">A </w:t>
-      </w:r>
-      <w:r>
-        <w:rPr>
-          <w:rFonts w:ascii="Times New Roman" w:hAnsi="Times New Roman" w:cs="Times New Roman"/>
-          <w:b/>
-          <w:bCs/>
-        </w:rPr>
-        <w:t>custom skeletal dataset</w:t>
-      </w:r>
-      <w:r>
-        <w:rPr>
-          <w:rFonts w:ascii="Times New Roman" w:hAnsi="Times New Roman" w:cs="Times New Roman"/>
-        </w:rPr>
-        <w:t xml:space="preserve"> was collected specifically for this study. The dataset consists of recordings from </w:t>
-      </w:r>
-      <w:r>
-        <w:rPr>
-          <w:rFonts w:ascii="Times New Roman" w:hAnsi="Times New Roman" w:cs="Times New Roman"/>
-          <w:b/>
-          <w:bCs/>
-        </w:rPr>
-        <w:t>30 volunteers</w:t>
-      </w:r>
-      <w:r>
-        <w:rPr>
-          <w:rFonts w:ascii="Times New Roman" w:hAnsi="Times New Roman" w:cs="Times New Roman"/>
-        </w:rPr>
-        <w:t xml:space="preserve"> of varying ages, body shapes, heights, and genders to capture inter-subject motion variability. Each participant performed </w:t>
-      </w:r>
-      <w:r>
-        <w:rPr>
-          <w:rFonts w:ascii="Times New Roman" w:hAnsi="Times New Roman" w:cs="Times New Roman"/>
-          <w:b/>
-          <w:bCs/>
-        </w:rPr>
-        <w:t>seven daily activities</w:t>
-      </w:r>
-      <w:r>
-        <w:rPr>
-          <w:rFonts w:ascii="Times New Roman" w:hAnsi="Times New Roman" w:cs="Times New Roman"/>
-        </w:rPr>
-        <w:t>: bending, jumping, running, sitting, squatting, standing, and walking. Data collection was conducted in a controlled indoor environment to reduce external disturbances while preserving natural movement execution. The dataset is organized hierarchically by subject, with individual folders containing separate CSV files for each activity. Each CSV file stores time-series skeletal data, where each frame contains the 3D coordinates of all tracked joints along with auxiliary</w:t>
-      </w:r>
-      <w:r>
-        <w:rPr>
-          <w:rFonts w:ascii="Times New Roman" w:hAnsi="Times New Roman" w:cs="Times New Roman"/>
-        </w:rPr>
-        <w:t xml:space="preserve"> </w:t>
-      </w:r>
-      <w:r>
-        <w:rPr>
-          <w:rFonts w:ascii="Times New Roman" w:hAnsi="Times New Roman" w:cs="Times New Roman"/>
-        </w:rPr>
-        <w:t>metadata.</w:t>
-      </w:r>
-      <w:r>
-        <w:rPr>
-          <w:rFonts w:ascii="Times New Roman" w:hAnsi="Times New Roman" w:cs="Times New Roman"/>
-        </w:rPr>
-        <w:t xml:space="preserve"> </w:t>
-      </w:r>
-    </w:p>
-    <w:p>
-      <w:pPr>
-        <w:jc w:val="both"/>
-        <w:rPr>
-          <w:rFonts w:ascii="Times New Roman" w:hAnsi="Times New Roman" w:cs="Times New Roman"/>
-        </w:rPr>
-      </w:pPr>
-      <w:r>
-        <w:rPr>
-          <w:rFonts w:ascii="Times New Roman" w:hAnsi="Times New Roman" w:cs="Times New Roman"/>
-        </w:rPr>
-        <w:t xml:space="preserve">To assess the general applicability of the experimental setup across datasets, the </w:t>
-      </w:r>
-      <w:r>
-        <w:rPr>
-          <w:rFonts w:ascii="Times New Roman" w:hAnsi="Times New Roman" w:cs="Times New Roman"/>
-          <w:b/>
-          <w:bCs/>
-        </w:rPr>
-        <w:t>Kinect Activity Recognition Dataset (KARD)</w:t>
-      </w:r>
-      <w:r>
-        <w:rPr>
-          <w:rFonts w:ascii="Times New Roman" w:hAnsi="Times New Roman" w:cs="Times New Roman"/>
-        </w:rPr>
-        <w:t xml:space="preserve"> was employed as an external benchmark. KARD consists of skeletal recordings of </w:t>
+        <w:t xml:space="preserve">consists of skeletal recordings of </w:t>
       </w:r>
       <w:r>
         <w:rPr>
@@ -17563,7 +18189,6 @@
           <w:b/>
           <w:bCs/>
         </w:rPr>
-        <w:lastRenderedPageBreak/>
         <w:t>Recall</w:t>
       </w:r>
       <w:r>
@@ -17758,6 +18383,7 @@
           <w:b/>
           <w:bCs/>
         </w:rPr>
+        <w:lastRenderedPageBreak/>
         <w:t>Accuracy</w:t>
       </w:r>
       <w:r>
@@ -18285,140 +18911,146 @@
           <w:b/>
           <w:bCs/>
         </w:rPr>
+        <w:t>5. Results and Discussion</w:t>
+      </w:r>
+    </w:p>
+    <w:p>
+      <w:pPr>
+        <w:jc w:val="both"/>
+        <w:rPr>
+          <w:rFonts w:ascii="Times New Roman" w:hAnsi="Times New Roman" w:cs="Times New Roman"/>
+          <w:b/>
+          <w:bCs/>
+        </w:rPr>
+      </w:pPr>
+      <w:r>
+        <w:rPr>
+          <w:rFonts w:ascii="Times New Roman" w:hAnsi="Times New Roman" w:cs="Times New Roman"/>
+          <w:b/>
+          <w:bCs/>
+        </w:rPr>
+        <w:t>5.1 Classification Accuracy</w:t>
+      </w:r>
+    </w:p>
+    <w:p>
+      <w:pPr>
+        <w:jc w:val="both"/>
+        <w:rPr>
+          <w:rFonts w:ascii="Times New Roman" w:hAnsi="Times New Roman" w:cs="Times New Roman"/>
+        </w:rPr>
+      </w:pPr>
+      <w:r>
+        <w:rPr>
+          <w:rFonts w:ascii="Times New Roman" w:hAnsi="Times New Roman" w:cs="Times New Roman"/>
+        </w:rPr>
+        <w:t xml:space="preserve">This section presents a detailed analysis of the classification performance achieved by the proposed </w:t>
+      </w:r>
+      <w:r>
+        <w:rPr>
+          <w:rFonts w:ascii="Times New Roman" w:hAnsi="Times New Roman" w:cs="Times New Roman"/>
+          <w:b/>
+          <w:bCs/>
+        </w:rPr>
+        <w:t xml:space="preserve">Multi-Scale Gated Residual Skip </w:t>
+      </w:r>
+      <w:proofErr w:type="spellStart"/>
+      <w:r>
+        <w:rPr>
+          <w:rFonts w:ascii="Times New Roman" w:hAnsi="Times New Roman" w:cs="Times New Roman"/>
+          <w:b/>
+          <w:bCs/>
+        </w:rPr>
+        <w:t>BiLSTM</w:t>
+      </w:r>
+      <w:proofErr w:type="spellEnd"/>
+      <w:r>
+        <w:rPr>
+          <w:rFonts w:ascii="Times New Roman" w:hAnsi="Times New Roman" w:cs="Times New Roman"/>
+          <w:b/>
+          <w:bCs/>
+        </w:rPr>
+        <w:t xml:space="preserve"> (MS-GRS-</w:t>
+      </w:r>
+      <w:proofErr w:type="spellStart"/>
+      <w:r>
+        <w:rPr>
+          <w:rFonts w:ascii="Times New Roman" w:hAnsi="Times New Roman" w:cs="Times New Roman"/>
+          <w:b/>
+          <w:bCs/>
+        </w:rPr>
+        <w:t>BiLSTM</w:t>
+      </w:r>
+      <w:proofErr w:type="spellEnd"/>
+      <w:r>
+        <w:rPr>
+          <w:rFonts w:ascii="Times New Roman" w:hAnsi="Times New Roman" w:cs="Times New Roman"/>
+          <w:b/>
+          <w:bCs/>
+        </w:rPr>
+        <w:t>)</w:t>
+      </w:r>
+      <w:r>
+        <w:rPr>
+          <w:rFonts w:ascii="Times New Roman" w:hAnsi="Times New Roman" w:cs="Times New Roman"/>
+        </w:rPr>
+        <w:t xml:space="preserve"> model in comparison with baseline recurrent architectures. The discussion not only reports numerical results but also explains the underlying reasons for the observed performance trends, highlighting both strengths and limitations of the evaluated approaches.</w:t>
+      </w:r>
+    </w:p>
+    <w:p>
+      <w:pPr>
+        <w:jc w:val="both"/>
+        <w:rPr>
+          <w:rFonts w:ascii="Times New Roman" w:hAnsi="Times New Roman" w:cs="Times New Roman"/>
+        </w:rPr>
+      </w:pPr>
+      <w:r>
+        <w:rPr>
+          <w:rFonts w:ascii="Times New Roman" w:hAnsi="Times New Roman" w:cs="Times New Roman"/>
+        </w:rPr>
+        <w:t xml:space="preserve">The classification accuracy obtained on the custom skeletal joint dataset is summarized in </w:t>
+      </w:r>
+      <w:r>
+        <w:rPr>
+          <w:rFonts w:ascii="Times New Roman" w:hAnsi="Times New Roman" w:cs="Times New Roman"/>
+          <w:b/>
+          <w:bCs/>
+        </w:rPr>
+        <w:t xml:space="preserve">Table </w:t>
+      </w:r>
+      <w:r>
+        <w:rPr>
+          <w:rFonts w:ascii="Times New Roman" w:hAnsi="Times New Roman" w:cs="Times New Roman"/>
+          <w:b/>
+          <w:bCs/>
+        </w:rPr>
+        <w:t>4</w:t>
+      </w:r>
+      <w:r>
+        <w:rPr>
+          <w:rFonts w:ascii="Times New Roman" w:hAnsi="Times New Roman" w:cs="Times New Roman"/>
+        </w:rPr>
+        <w:t xml:space="preserve">. The standard LSTM model achieves an accuracy of </w:t>
+      </w:r>
+      <w:r>
+        <w:rPr>
+          <w:rFonts w:ascii="Times New Roman" w:hAnsi="Times New Roman" w:cs="Times New Roman"/>
+          <w:b/>
+          <w:bCs/>
+        </w:rPr>
+        <w:t>76.19%</w:t>
+      </w:r>
+      <w:r>
+        <w:rPr>
+          <w:rFonts w:ascii="Times New Roman" w:hAnsi="Times New Roman" w:cs="Times New Roman"/>
+        </w:rPr>
+        <w:t xml:space="preserve">, which can be attributed to its unidirectional temporal processing that restricts the model to learning only past dependencies. Human activities, however, often involve transitional and anticipatory motion </w:t>
+      </w:r>
+      <w:r>
+        <w:rPr>
+          <w:rFonts w:ascii="Times New Roman" w:hAnsi="Times New Roman" w:cs="Times New Roman"/>
+        </w:rPr>
         <w:lastRenderedPageBreak/>
-        <w:t>5. Results and Discussion</w:t>
-      </w:r>
-    </w:p>
-    <w:p>
-      <w:pPr>
-        <w:jc w:val="both"/>
-        <w:rPr>
-          <w:rFonts w:ascii="Times New Roman" w:hAnsi="Times New Roman" w:cs="Times New Roman"/>
-          <w:b/>
-          <w:bCs/>
-        </w:rPr>
-      </w:pPr>
-      <w:r>
-        <w:rPr>
-          <w:rFonts w:ascii="Times New Roman" w:hAnsi="Times New Roman" w:cs="Times New Roman"/>
-          <w:b/>
-          <w:bCs/>
-        </w:rPr>
-        <w:t>5.1 Classification Accuracy</w:t>
-      </w:r>
-    </w:p>
-    <w:p>
-      <w:pPr>
-        <w:jc w:val="both"/>
-        <w:rPr>
-          <w:rFonts w:ascii="Times New Roman" w:hAnsi="Times New Roman" w:cs="Times New Roman"/>
-        </w:rPr>
-      </w:pPr>
-      <w:r>
-        <w:rPr>
-          <w:rFonts w:ascii="Times New Roman" w:hAnsi="Times New Roman" w:cs="Times New Roman"/>
-        </w:rPr>
-        <w:t xml:space="preserve">This section presents a detailed analysis of the classification performance achieved by the proposed </w:t>
-      </w:r>
-      <w:r>
-        <w:rPr>
-          <w:rFonts w:ascii="Times New Roman" w:hAnsi="Times New Roman" w:cs="Times New Roman"/>
-          <w:b/>
-          <w:bCs/>
-        </w:rPr>
-        <w:t xml:space="preserve">Multi-Scale Gated Residual Skip </w:t>
-      </w:r>
-      <w:proofErr w:type="spellStart"/>
-      <w:r>
-        <w:rPr>
-          <w:rFonts w:ascii="Times New Roman" w:hAnsi="Times New Roman" w:cs="Times New Roman"/>
-          <w:b/>
-          <w:bCs/>
-        </w:rPr>
-        <w:t>BiLSTM</w:t>
-      </w:r>
-      <w:proofErr w:type="spellEnd"/>
-      <w:r>
-        <w:rPr>
-          <w:rFonts w:ascii="Times New Roman" w:hAnsi="Times New Roman" w:cs="Times New Roman"/>
-          <w:b/>
-          <w:bCs/>
-        </w:rPr>
-        <w:t xml:space="preserve"> (MS-GRS-</w:t>
-      </w:r>
-      <w:proofErr w:type="spellStart"/>
-      <w:r>
-        <w:rPr>
-          <w:rFonts w:ascii="Times New Roman" w:hAnsi="Times New Roman" w:cs="Times New Roman"/>
-          <w:b/>
-          <w:bCs/>
-        </w:rPr>
-        <w:t>BiLSTM</w:t>
-      </w:r>
-      <w:proofErr w:type="spellEnd"/>
-      <w:r>
-        <w:rPr>
-          <w:rFonts w:ascii="Times New Roman" w:hAnsi="Times New Roman" w:cs="Times New Roman"/>
-          <w:b/>
-          <w:bCs/>
-        </w:rPr>
-        <w:t>)</w:t>
-      </w:r>
-      <w:r>
-        <w:rPr>
-          <w:rFonts w:ascii="Times New Roman" w:hAnsi="Times New Roman" w:cs="Times New Roman"/>
-        </w:rPr>
-        <w:t xml:space="preserve"> model in comparison with baseline recurrent architectures. The discussion not only reports numerical results but also explains the underlying reasons for the observed performance trends, highlighting both strengths and limitations of the evaluated approaches.</w:t>
-      </w:r>
-    </w:p>
-    <w:p>
-      <w:pPr>
-        <w:jc w:val="both"/>
-        <w:rPr>
-          <w:rFonts w:ascii="Times New Roman" w:hAnsi="Times New Roman" w:cs="Times New Roman"/>
-        </w:rPr>
-      </w:pPr>
-      <w:r>
-        <w:rPr>
-          <w:rFonts w:ascii="Times New Roman" w:hAnsi="Times New Roman" w:cs="Times New Roman"/>
-        </w:rPr>
-        <w:t xml:space="preserve">The classification accuracy obtained on the custom skeletal joint dataset is summarized in </w:t>
-      </w:r>
-      <w:r>
-        <w:rPr>
-          <w:rFonts w:ascii="Times New Roman" w:hAnsi="Times New Roman" w:cs="Times New Roman"/>
-          <w:b/>
-          <w:bCs/>
-        </w:rPr>
-        <w:t xml:space="preserve">Table </w:t>
-      </w:r>
-      <w:r>
-        <w:rPr>
-          <w:rFonts w:ascii="Times New Roman" w:hAnsi="Times New Roman" w:cs="Times New Roman"/>
-          <w:b/>
-          <w:bCs/>
-        </w:rPr>
-        <w:t>4</w:t>
-      </w:r>
-      <w:r>
-        <w:rPr>
-          <w:rFonts w:ascii="Times New Roman" w:hAnsi="Times New Roman" w:cs="Times New Roman"/>
-        </w:rPr>
-        <w:t xml:space="preserve">. The standard LSTM model achieves an accuracy of </w:t>
-      </w:r>
-      <w:r>
-        <w:rPr>
-          <w:rFonts w:ascii="Times New Roman" w:hAnsi="Times New Roman" w:cs="Times New Roman"/>
-          <w:b/>
-          <w:bCs/>
-        </w:rPr>
-        <w:t>76.19%</w:t>
-      </w:r>
-      <w:r>
-        <w:rPr>
-          <w:rFonts w:ascii="Times New Roman" w:hAnsi="Times New Roman" w:cs="Times New Roman"/>
-        </w:rPr>
-        <w:t xml:space="preserve">, which can be attributed to its unidirectional temporal processing that restricts the model to learning only past dependencies. Human activities, however, often involve transitional and anticipatory motion patterns, which are not fully captured by such a formulation. The </w:t>
+        <w:t xml:space="preserve">patterns, which are not fully captured by such a formulation. The </w:t>
       </w:r>
       <w:proofErr w:type="spellStart"/>
       <w:r>
@@ -19512,15 +20144,7 @@
           <w:b/>
           <w:bCs/>
         </w:rPr>
-        <w:t xml:space="preserve"> </w:t>
-      </w:r>
-      <w:r>
-        <w:rPr>
-          <w:rFonts w:ascii="Times New Roman" w:hAnsi="Times New Roman" w:cs="Times New Roman"/>
-          <w:b/>
-          <w:bCs/>
-        </w:rPr>
-        <w:t xml:space="preserve">using (a) LSTM (b) </w:t>
+        <w:t xml:space="preserve"> using (a) LSTM (b) </w:t>
       </w:r>
       <w:proofErr w:type="spellStart"/>
       <w:r>
@@ -21444,7 +22068,7 @@
                 <w:noProof/>
               </w:rPr>
               <w:drawing>
-                <wp:inline distT="0" distB="0" distL="0" distR="0" wp14:anchorId="24A12597" wp14:editId="7048CEE5">
+                <wp:inline distT="0" distB="0" distL="0" distR="0" wp14:anchorId="24A12597" wp14:editId="2A94C4A6">
                   <wp:extent cx="3174365" cy="1904761"/>
                   <wp:effectExtent l="0" t="0" r="6985" b="635"/>
                   <wp:docPr id="1558129931" name="Picture 17"/>
@@ -21508,7 +22132,7 @@
                 <w:noProof/>
               </w:rPr>
               <w:drawing>
-                <wp:inline distT="0" distB="0" distL="0" distR="0" wp14:anchorId="788D5D39" wp14:editId="6CB4D47E">
+                <wp:inline distT="0" distB="0" distL="0" distR="0" wp14:anchorId="788D5D39" wp14:editId="60E41F61">
                   <wp:extent cx="3090106" cy="1854200"/>
                   <wp:effectExtent l="0" t="0" r="0" b="0"/>
                   <wp:docPr id="1692232406" name="Picture 18"/>
@@ -21628,7 +22252,7 @@
                 <w:noProof/>
               </w:rPr>
               <w:drawing>
-                <wp:inline distT="0" distB="0" distL="0" distR="0" wp14:anchorId="7DE9576F" wp14:editId="7609B014">
+                <wp:inline distT="0" distB="0" distL="0" distR="0" wp14:anchorId="7DE9576F" wp14:editId="0E0B41B3">
                   <wp:extent cx="3153600" cy="1892300"/>
                   <wp:effectExtent l="0" t="0" r="8890" b="0"/>
                   <wp:docPr id="1943350678" name="Picture 19"/>
@@ -21692,7 +22316,7 @@
                 <w:noProof/>
               </w:rPr>
               <w:drawing>
-                <wp:inline distT="0" distB="0" distL="0" distR="0" wp14:anchorId="38DD438D" wp14:editId="7EF77328">
+                <wp:inline distT="0" distB="0" distL="0" distR="0" wp14:anchorId="38DD438D" wp14:editId="607545FF">
                   <wp:extent cx="3102610" cy="1861703"/>
                   <wp:effectExtent l="0" t="0" r="2540" b="5715"/>
                   <wp:docPr id="1018032063" name="Picture 20"/>
@@ -21843,15 +22467,7 @@
           <w:b/>
           <w:bCs/>
         </w:rPr>
-        <w:t>Accuracy &amp; Loss over training and validation on KARD dataset using</w:t>
-      </w:r>
-      <w:r>
-        <w:rPr>
-          <w:rFonts w:ascii="Times New Roman" w:hAnsi="Times New Roman" w:cs="Times New Roman"/>
-          <w:b/>
-          <w:bCs/>
-        </w:rPr>
-        <w:t xml:space="preserve"> (a) LSTM (b) </w:t>
+        <w:t xml:space="preserve">Accuracy &amp; Loss over training and validation on KARD dataset using (a) LSTM (b) </w:t>
       </w:r>
       <w:proofErr w:type="spellStart"/>
       <w:r>
@@ -21887,15 +22503,7 @@
           <w:b/>
           <w:bCs/>
         </w:rPr>
-        <w:t xml:space="preserve"> (d)</w:t>
-      </w:r>
-      <w:r>
-        <w:rPr>
-          <w:rFonts w:ascii="Times New Roman" w:hAnsi="Times New Roman" w:cs="Times New Roman"/>
-          <w:b/>
-          <w:bCs/>
-        </w:rPr>
-        <w:t xml:space="preserve"> MS-GRS-</w:t>
+        <w:t xml:space="preserve"> (d) MS-GRS-</w:t>
       </w:r>
       <w:proofErr w:type="spellStart"/>
       <w:r>
@@ -23503,7 +24111,7 @@
                 <w:noProof/>
               </w:rPr>
               <w:drawing>
-                <wp:inline distT="0" distB="0" distL="0" distR="0" wp14:anchorId="5817CA00" wp14:editId="35DD8F10">
+                <wp:inline distT="0" distB="0" distL="0" distR="0" wp14:anchorId="5817CA00" wp14:editId="7F9A6082">
                   <wp:extent cx="2984500" cy="2133600"/>
                   <wp:effectExtent l="0" t="0" r="6350" b="0"/>
                   <wp:docPr id="1775505002" name="Picture 21"/>
@@ -23568,7 +24176,7 @@
                 <w:noProof/>
               </w:rPr>
               <w:drawing>
-                <wp:inline distT="0" distB="0" distL="0" distR="0" wp14:anchorId="4BBA4C4A" wp14:editId="3BB8A6A3">
+                <wp:inline distT="0" distB="0" distL="0" distR="0" wp14:anchorId="4BBA4C4A" wp14:editId="39E0C961">
                   <wp:extent cx="2800350" cy="2090420"/>
                   <wp:effectExtent l="0" t="0" r="0" b="5080"/>
                   <wp:docPr id="154114455" name="Picture 22"/>
@@ -23693,7 +24301,7 @@
                 <w:noProof/>
               </w:rPr>
               <w:drawing>
-                <wp:inline distT="0" distB="0" distL="0" distR="0" wp14:anchorId="3410248D" wp14:editId="6CEF8470">
+                <wp:inline distT="0" distB="0" distL="0" distR="0" wp14:anchorId="3410248D" wp14:editId="5637E88A">
                   <wp:extent cx="3067050" cy="2047875"/>
                   <wp:effectExtent l="0" t="0" r="0" b="9525"/>
                   <wp:docPr id="896942188" name="Picture 23"/>
@@ -23758,7 +24366,7 @@
                 <w:noProof/>
               </w:rPr>
               <w:drawing>
-                <wp:inline distT="0" distB="0" distL="0" distR="0" wp14:anchorId="293A26DD" wp14:editId="17C147E3">
+                <wp:inline distT="0" distB="0" distL="0" distR="0" wp14:anchorId="293A26DD" wp14:editId="7F7F6AFA">
                   <wp:extent cx="2755900" cy="2067078"/>
                   <wp:effectExtent l="0" t="0" r="6350" b="9525"/>
                   <wp:docPr id="217125869" name="Picture 24"/>
@@ -24031,15 +24639,7 @@
           <w:b/>
           <w:bCs/>
         </w:rPr>
-        <w:t xml:space="preserve"> </w:t>
-      </w:r>
-      <w:r>
-        <w:rPr>
-          <w:rFonts w:ascii="Times New Roman" w:hAnsi="Times New Roman" w:cs="Times New Roman"/>
-          <w:b/>
-          <w:bCs/>
-        </w:rPr>
-        <w:t xml:space="preserve">using (a) LSTM (b) </w:t>
+        <w:t xml:space="preserve"> using (a) LSTM (b) </w:t>
       </w:r>
       <w:proofErr w:type="spellStart"/>
       <w:r>
@@ -24813,23 +25413,7 @@
           <w:b/>
           <w:bCs/>
         </w:rPr>
-        <w:t xml:space="preserve">Confusion Matrix on </w:t>
-      </w:r>
-      <w:r>
-        <w:rPr>
-          <w:rFonts w:ascii="Times New Roman" w:hAnsi="Times New Roman" w:cs="Times New Roman"/>
-          <w:b/>
-          <w:bCs/>
-        </w:rPr>
-        <w:t>KARD</w:t>
-      </w:r>
-      <w:r>
-        <w:rPr>
-          <w:rFonts w:ascii="Times New Roman" w:hAnsi="Times New Roman" w:cs="Times New Roman"/>
-          <w:b/>
-          <w:bCs/>
-        </w:rPr>
-        <w:t xml:space="preserve"> Dataset using MS-GRS-</w:t>
+        <w:t>Confusion Matrix on KARD Dataset using MS-GRS-</w:t>
       </w:r>
       <w:proofErr w:type="spellStart"/>
       <w:r>
@@ -24855,15 +25439,7 @@
           <w:b/>
           <w:bCs/>
         </w:rPr>
-        <w:t xml:space="preserve"> </w:t>
-      </w:r>
-      <w:r>
-        <w:rPr>
-          <w:rFonts w:ascii="Times New Roman" w:hAnsi="Times New Roman" w:cs="Times New Roman"/>
-          <w:b/>
-          <w:bCs/>
-        </w:rPr>
-        <w:t xml:space="preserve">using (a) LSTM (b) </w:t>
+        <w:t xml:space="preserve"> using (a) LSTM (b) </w:t>
       </w:r>
       <w:proofErr w:type="spellStart"/>
       <w:r>
@@ -33599,13 +34175,7 @@
         <w:rPr>
           <w:rFonts w:ascii="Times New Roman" w:hAnsi="Times New Roman" w:cs="Times New Roman"/>
         </w:rPr>
-        <w:t xml:space="preserve"> </w:t>
-      </w:r>
-      <w:r>
-        <w:rPr>
-          <w:rFonts w:ascii="Times New Roman" w:hAnsi="Times New Roman" w:cs="Times New Roman"/>
-        </w:rPr>
-        <w:t>Kumar, S. K. Singh, and R. Kala, "</w:t>
+        <w:t xml:space="preserve"> Kumar, S. K. Singh, and R. Kala, "</w:t>
       </w:r>
       <w:r>
         <w:rPr>
@@ -34986,6 +35556,168 @@
         </w:rPr>
         <w:t>, 2013, pp. 340–345.</w:t>
       </w:r>
+    </w:p>
+    <w:p>
+      <w:pPr>
+        <w:numPr>
+          <w:ilvl w:val="0"/>
+          <w:numId w:val="22"/>
+        </w:numPr>
+        <w:jc w:val="both"/>
+        <w:rPr>
+          <w:rFonts w:ascii="Times New Roman" w:hAnsi="Times New Roman" w:cs="Times New Roman"/>
+        </w:rPr>
+      </w:pPr>
+      <w:r>
+        <w:rPr>
+          <w:rFonts w:ascii="Times New Roman" w:hAnsi="Times New Roman" w:cs="Times New Roman"/>
+        </w:rPr>
+        <w:t xml:space="preserve"> </w:t>
+      </w:r>
+      <w:r>
+        <w:rPr>
+          <w:rFonts w:ascii="Times New Roman" w:hAnsi="Times New Roman" w:cs="Times New Roman"/>
+        </w:rPr>
+        <w:t>S. K. Yadav, K. Tiwari, H. M. Pandey, and S. A. Akbar, "</w:t>
+      </w:r>
+      <w:r>
+        <w:rPr>
+          <w:rFonts w:ascii="Times New Roman" w:hAnsi="Times New Roman" w:cs="Times New Roman"/>
+          <w:b/>
+          <w:bCs/>
+        </w:rPr>
+        <w:t xml:space="preserve">Skeleton-based human activity recognition using </w:t>
+      </w:r>
+      <w:proofErr w:type="spellStart"/>
+      <w:r>
+        <w:rPr>
+          <w:rFonts w:ascii="Times New Roman" w:hAnsi="Times New Roman" w:cs="Times New Roman"/>
+          <w:b/>
+          <w:bCs/>
+        </w:rPr>
+        <w:t>ConvLSTM</w:t>
+      </w:r>
+      <w:proofErr w:type="spellEnd"/>
+      <w:r>
+        <w:rPr>
+          <w:rFonts w:ascii="Times New Roman" w:hAnsi="Times New Roman" w:cs="Times New Roman"/>
+          <w:b/>
+          <w:bCs/>
+        </w:rPr>
+        <w:t xml:space="preserve"> and guided feature learning</w:t>
+      </w:r>
+      <w:r>
+        <w:rPr>
+          <w:rFonts w:ascii="Times New Roman" w:hAnsi="Times New Roman" w:cs="Times New Roman"/>
+        </w:rPr>
+        <w:t xml:space="preserve">," </w:t>
+      </w:r>
+      <w:r>
+        <w:rPr>
+          <w:rFonts w:ascii="Times New Roman" w:hAnsi="Times New Roman" w:cs="Times New Roman"/>
+          <w:i/>
+          <w:iCs/>
+        </w:rPr>
+        <w:t xml:space="preserve">Soft </w:t>
+      </w:r>
+      <w:proofErr w:type="spellStart"/>
+      <w:r>
+        <w:rPr>
+          <w:rFonts w:ascii="Times New Roman" w:hAnsi="Times New Roman" w:cs="Times New Roman"/>
+          <w:i/>
+          <w:iCs/>
+        </w:rPr>
+        <w:t>Comput</w:t>
+      </w:r>
+      <w:proofErr w:type="spellEnd"/>
+      <w:r>
+        <w:rPr>
+          <w:rFonts w:ascii="Times New Roman" w:hAnsi="Times New Roman" w:cs="Times New Roman"/>
+          <w:i/>
+          <w:iCs/>
+        </w:rPr>
+        <w:t>.</w:t>
+      </w:r>
+      <w:r>
+        <w:rPr>
+          <w:rFonts w:ascii="Times New Roman" w:hAnsi="Times New Roman" w:cs="Times New Roman"/>
+        </w:rPr>
+        <w:t>, 2021.</w:t>
+      </w:r>
+    </w:p>
+    <w:p>
+      <w:pPr>
+        <w:pStyle w:val="ListParagraph"/>
+        <w:numPr>
+          <w:ilvl w:val="0"/>
+          <w:numId w:val="22"/>
+        </w:numPr>
+        <w:spacing w:after="0" w:line="240" w:lineRule="auto"/>
+        <w:rPr>
+          <w:rFonts w:ascii="Times New Roman" w:eastAsia="Times New Roman" w:hAnsi="Times New Roman" w:cs="Times New Roman"/>
+          <w:kern w:val="0"/>
+          <w:lang w:eastAsia="en-IN"/>
+          <w14:ligatures w14:val="none"/>
+        </w:rPr>
+      </w:pPr>
+      <w:r>
+        <w:rPr>
+          <w:rFonts w:ascii="Times New Roman" w:eastAsia="Times New Roman" w:hAnsi="Times New Roman" w:cs="Times New Roman"/>
+          <w:kern w:val="0"/>
+          <w:lang w:eastAsia="en-IN"/>
+          <w14:ligatures w14:val="none"/>
+        </w:rPr>
+        <w:t>D. Garcia-Gonzalez, D. Rivero, E. Fernandez-Blanco, and M. R. Luaces, "</w:t>
+      </w:r>
+      <w:r>
+        <w:rPr>
+          <w:rFonts w:ascii="Times New Roman" w:eastAsia="Times New Roman" w:hAnsi="Times New Roman" w:cs="Times New Roman"/>
+          <w:b/>
+          <w:bCs/>
+          <w:kern w:val="0"/>
+          <w:lang w:eastAsia="en-IN"/>
+          <w14:ligatures w14:val="none"/>
+        </w:rPr>
+        <w:t>Deep learning models for real-life human activity recognition from smartphone sensor data</w:t>
+      </w:r>
+      <w:r>
+        <w:rPr>
+          <w:rFonts w:ascii="Times New Roman" w:eastAsia="Times New Roman" w:hAnsi="Times New Roman" w:cs="Times New Roman"/>
+          <w:kern w:val="0"/>
+          <w:lang w:eastAsia="en-IN"/>
+          <w14:ligatures w14:val="none"/>
+        </w:rPr>
+        <w:t xml:space="preserve">," </w:t>
+      </w:r>
+      <w:r>
+        <w:rPr>
+          <w:rFonts w:ascii="Times New Roman" w:eastAsia="Times New Roman" w:hAnsi="Times New Roman" w:cs="Times New Roman"/>
+          <w:i/>
+          <w:iCs/>
+          <w:kern w:val="0"/>
+          <w:lang w:eastAsia="en-IN"/>
+          <w14:ligatures w14:val="none"/>
+        </w:rPr>
+        <w:t>Internet of Things</w:t>
+      </w:r>
+      <w:r>
+        <w:rPr>
+          <w:rFonts w:ascii="Times New Roman" w:eastAsia="Times New Roman" w:hAnsi="Times New Roman" w:cs="Times New Roman"/>
+          <w:kern w:val="0"/>
+          <w:lang w:eastAsia="en-IN"/>
+          <w14:ligatures w14:val="none"/>
+        </w:rPr>
+        <w:t>, vol. 24, p. 100925, 2023.</w:t>
+      </w:r>
+    </w:p>
+    <w:p>
+      <w:pPr>
+        <w:ind w:left="720"/>
+        <w:jc w:val="both"/>
+        <w:rPr>
+          <w:rFonts w:ascii="Times New Roman" w:hAnsi="Times New Roman" w:cs="Times New Roman"/>
+        </w:rPr>
+      </w:pPr>
     </w:p>
     <w:p>
       <w:pPr>
@@ -39477,6 +40209,11 @@
       </w:tblBorders>
     </w:tblPr>
   </w:style>
+  <w:style w:type="character" w:customStyle="1" w:styleId="ng-star-inserted">
+    <w:name w:val="ng-star-inserted"/>
+    <w:basedOn w:val="DefaultParagraphFont"/>
+    <w:rsid w:val="00B547BE"/>
+  </w:style>
 </w:styles>
 </file>
 

</xml_diff>